<commit_message>
7th and 8th practics for database development
</commit_message>
<xml_diff>
--- a/Sem5/DBD/Отчеты/КомисарикМА_Отчет7.docx
+++ b/Sem5/DBD/Отчеты/КомисарикМА_Отчет7.docx
@@ -43,7 +43,7 @@
                 <w:lang w:eastAsia="ru-RU" w:bidi="ar-SA"/>
               </w:rPr>
               <w:drawing>
-                <wp:inline distT="0" distB="0" distL="0" distR="0" wp14:anchorId="03384337" wp14:editId="2E78CF19">
+                <wp:inline distT="0" distB="0" distL="0" distR="0" wp14:anchorId="03384337" wp14:editId="616495AD">
                   <wp:extent cx="1066800" cy="1066800"/>
                   <wp:effectExtent l="0" t="0" r="0" b="0"/>
                   <wp:docPr id="18" name="Рисунок 3"/>
@@ -671,7 +671,6 @@
                 <w:iCs/>
               </w:rPr>
             </w:pPr>
-            <w:proofErr w:type="spellStart"/>
             <w:r>
               <w:rPr>
                 <w:rFonts w:cs="Times New Roman"/>
@@ -680,7 +679,6 @@
               </w:rPr>
               <w:t>Брайловский</w:t>
             </w:r>
-            <w:proofErr w:type="spellEnd"/>
             <w:r>
               <w:rPr>
                 <w:rFonts w:cs="Times New Roman"/>
@@ -854,21 +852,7 @@
               <w:rPr>
                 <w:rFonts w:cs="Times New Roman"/>
               </w:rPr>
-              <w:t>«__</w:t>
-            </w:r>
-            <w:proofErr w:type="gramStart"/>
-            <w:r>
-              <w:rPr>
-                <w:rFonts w:cs="Times New Roman"/>
-              </w:rPr>
-              <w:t>_»_</w:t>
-            </w:r>
-            <w:proofErr w:type="gramEnd"/>
-            <w:r>
-              <w:rPr>
-                <w:rFonts w:cs="Times New Roman"/>
-              </w:rPr>
-              <w:t>_______2025 г.</w:t>
+              <w:t>«___»________2025 г.</w:t>
             </w:r>
           </w:p>
         </w:tc>
@@ -1057,15 +1041,7 @@
         <w:t xml:space="preserve">: </w:t>
       </w:r>
       <w:r>
-        <w:t xml:space="preserve">Формирование углубленных практических навыков по управлению данными и реализации сложной бизнес-логики в СУБД </w:t>
-      </w:r>
-      <w:proofErr w:type="spellStart"/>
-      <w:r>
-        <w:t>PostgreSQL</w:t>
-      </w:r>
-      <w:proofErr w:type="spellEnd"/>
-      <w:r>
-        <w:t xml:space="preserve"> с использованием триггеров и курсоров.</w:t>
+        <w:t>Формирование углубленных практических навыков по управлению данными и реализации сложной бизнес-логики в СУБД PostgreSQL с использованием триггеров и курсоров.</w:t>
       </w:r>
     </w:p>
     <w:p>
@@ -1096,14 +1072,7 @@
           <w:b/>
           <w:bCs/>
         </w:rPr>
-        <w:t>А</w:t>
-      </w:r>
-      <w:r>
-        <w:rPr>
-          <w:b/>
-          <w:bCs/>
-        </w:rPr>
-        <w:t>нализ и оптимизация</w:t>
+        <w:t>Анализ и оптимизация</w:t>
       </w:r>
       <w:r>
         <w:t>.</w:t>
@@ -1243,14 +1212,7 @@
           <w:b/>
           <w:bCs/>
         </w:rPr>
-        <w:t>Д</w:t>
-      </w:r>
-      <w:r>
-        <w:rPr>
-          <w:b/>
-          <w:bCs/>
-        </w:rPr>
-        <w:t>емонстрация атомарной транзакции (COMMIT)</w:t>
+        <w:t>Демонстрация атомарной транзакции (COMMIT)</w:t>
       </w:r>
       <w:r>
         <w:t>. Р</w:t>
@@ -1272,14 +1234,7 @@
           <w:b/>
           <w:bCs/>
         </w:rPr>
-        <w:t>Д</w:t>
-      </w:r>
-      <w:r>
-        <w:rPr>
-          <w:b/>
-          <w:bCs/>
-        </w:rPr>
-        <w:t>емонстрация отката транзакции (ROLLBACK)</w:t>
+        <w:t>Демонстрация отката транзакции (ROLLBACK)</w:t>
       </w:r>
       <w:r>
         <w:t xml:space="preserve">. </w:t>
@@ -2723,29 +2678,3817 @@
         <w:ind w:left="709"/>
       </w:pPr>
       <w:r>
+        <w:lastRenderedPageBreak/>
         <w:t>Подготовка базы данных</w:t>
       </w:r>
     </w:p>
     <w:p>
       <w:pPr>
+        <w:pStyle w:val="aa"/>
+        <w:keepNext/>
+      </w:pPr>
+      <w:r>
+        <w:rPr>
+          <w:lang w:val="en-US"/>
+        </w:rPr>
+        <w:drawing>
+          <wp:inline distT="0" distB="0" distL="0" distR="0" wp14:anchorId="1B14A2AE" wp14:editId="6D361076">
+            <wp:extent cx="3987800" cy="5252131"/>
+            <wp:effectExtent l="0" t="0" r="0" b="5715"/>
+            <wp:docPr id="1" name="Рисунок 1"/>
+            <wp:cNvGraphicFramePr>
+              <a:graphicFrameLocks xmlns:a="http://schemas.openxmlformats.org/drawingml/2006/main" noChangeAspect="1"/>
+            </wp:cNvGraphicFramePr>
+            <a:graphic xmlns:a="http://schemas.openxmlformats.org/drawingml/2006/main">
+              <a:graphicData uri="http://schemas.openxmlformats.org/drawingml/2006/picture">
+                <pic:pic xmlns:pic="http://schemas.openxmlformats.org/drawingml/2006/picture">
+                  <pic:nvPicPr>
+                    <pic:cNvPr id="1" name=""/>
+                    <pic:cNvPicPr/>
+                  </pic:nvPicPr>
+                  <pic:blipFill>
+                    <a:blip r:embed="rId24"/>
+                    <a:stretch>
+                      <a:fillRect/>
+                    </a:stretch>
+                  </pic:blipFill>
+                  <pic:spPr>
+                    <a:xfrm>
+                      <a:off x="0" y="0"/>
+                      <a:ext cx="3990299" cy="5255422"/>
+                    </a:xfrm>
+                    <a:prstGeom prst="rect">
+                      <a:avLst/>
+                    </a:prstGeom>
+                  </pic:spPr>
+                </pic:pic>
+              </a:graphicData>
+            </a:graphic>
+          </wp:inline>
+        </w:drawing>
+      </w:r>
+    </w:p>
+    <w:p>
+      <w:pPr>
+        <w:pStyle w:val="ab"/>
+      </w:pPr>
+      <w:r>
+        <w:t xml:space="preserve">Рисунок </w:t>
+      </w:r>
+      <w:r>
+        <w:fldChar w:fldCharType="begin"/>
+      </w:r>
+      <w:r>
+        <w:instrText xml:space="preserve"> SEQ Рисунок \* ARABIC </w:instrText>
+      </w:r>
+      <w:r>
+        <w:fldChar w:fldCharType="separate"/>
+      </w:r>
+      <w:r>
+        <w:rPr>
+          <w:noProof/>
+        </w:rPr>
+        <w:t>15</w:t>
+      </w:r>
+      <w:r>
+        <w:fldChar w:fldCharType="end"/>
+      </w:r>
+    </w:p>
+    <w:p>
+      <w:pPr>
+        <w:pStyle w:val="aa"/>
+        <w:keepNext/>
+      </w:pPr>
+      <w:r>
+        <w:drawing>
+          <wp:inline distT="0" distB="0" distL="0" distR="0" wp14:anchorId="18A52165" wp14:editId="0B08DF5C">
+            <wp:extent cx="3429000" cy="1980020"/>
+            <wp:effectExtent l="0" t="0" r="0" b="1270"/>
+            <wp:docPr id="4" name="Рисунок 4"/>
+            <wp:cNvGraphicFramePr>
+              <a:graphicFrameLocks xmlns:a="http://schemas.openxmlformats.org/drawingml/2006/main" noChangeAspect="1"/>
+            </wp:cNvGraphicFramePr>
+            <a:graphic xmlns:a="http://schemas.openxmlformats.org/drawingml/2006/main">
+              <a:graphicData uri="http://schemas.openxmlformats.org/drawingml/2006/picture">
+                <pic:pic xmlns:pic="http://schemas.openxmlformats.org/drawingml/2006/picture">
+                  <pic:nvPicPr>
+                    <pic:cNvPr id="1" name=""/>
+                    <pic:cNvPicPr/>
+                  </pic:nvPicPr>
+                  <pic:blipFill>
+                    <a:blip r:embed="rId25"/>
+                    <a:stretch>
+                      <a:fillRect/>
+                    </a:stretch>
+                  </pic:blipFill>
+                  <pic:spPr>
+                    <a:xfrm>
+                      <a:off x="0" y="0"/>
+                      <a:ext cx="3435704" cy="1983891"/>
+                    </a:xfrm>
+                    <a:prstGeom prst="rect">
+                      <a:avLst/>
+                    </a:prstGeom>
+                  </pic:spPr>
+                </pic:pic>
+              </a:graphicData>
+            </a:graphic>
+          </wp:inline>
+        </w:drawing>
+      </w:r>
+    </w:p>
+    <w:p>
+      <w:pPr>
+        <w:pStyle w:val="ab"/>
+      </w:pPr>
+      <w:r>
+        <w:t xml:space="preserve">Рисунок </w:t>
+      </w:r>
+      <w:r>
+        <w:fldChar w:fldCharType="begin"/>
+      </w:r>
+      <w:r>
+        <w:instrText xml:space="preserve"> SEQ Рисунок \* ARABIC </w:instrText>
+      </w:r>
+      <w:r>
+        <w:fldChar w:fldCharType="separate"/>
+      </w:r>
+      <w:r>
+        <w:rPr>
+          <w:noProof/>
+        </w:rPr>
+        <w:t>16</w:t>
+      </w:r>
+      <w:r>
+        <w:fldChar w:fldCharType="end"/>
+      </w:r>
+    </w:p>
+    <w:p>
+      <w:pPr>
+        <w:pStyle w:val="3"/>
+      </w:pPr>
+      <w:r>
+        <w:lastRenderedPageBreak/>
+        <w:t>Анализ и оптимизация</w:t>
+      </w:r>
+    </w:p>
+    <w:p>
+      <w:pPr>
+        <w:pStyle w:val="4"/>
+      </w:pPr>
+      <w:r>
+        <w:t>Стандартный поиск</w:t>
+      </w:r>
+    </w:p>
+    <w:p>
+      <w:pPr>
+        <w:pStyle w:val="aa"/>
+        <w:keepNext/>
+      </w:pPr>
+      <w:r>
+        <w:drawing>
+          <wp:inline distT="0" distB="0" distL="0" distR="0" wp14:anchorId="5D8E06FC" wp14:editId="5171C271">
+            <wp:extent cx="5747392" cy="2514600"/>
+            <wp:effectExtent l="0" t="0" r="5715" b="0"/>
+            <wp:docPr id="5" name="Рисунок 5"/>
+            <wp:cNvGraphicFramePr>
+              <a:graphicFrameLocks xmlns:a="http://schemas.openxmlformats.org/drawingml/2006/main" noChangeAspect="1"/>
+            </wp:cNvGraphicFramePr>
+            <a:graphic xmlns:a="http://schemas.openxmlformats.org/drawingml/2006/main">
+              <a:graphicData uri="http://schemas.openxmlformats.org/drawingml/2006/picture">
+                <pic:pic xmlns:pic="http://schemas.openxmlformats.org/drawingml/2006/picture">
+                  <pic:nvPicPr>
+                    <pic:cNvPr id="1" name=""/>
+                    <pic:cNvPicPr/>
+                  </pic:nvPicPr>
+                  <pic:blipFill>
+                    <a:blip r:embed="rId26"/>
+                    <a:stretch>
+                      <a:fillRect/>
+                    </a:stretch>
+                  </pic:blipFill>
+                  <pic:spPr>
+                    <a:xfrm>
+                      <a:off x="0" y="0"/>
+                      <a:ext cx="5782126" cy="2529797"/>
+                    </a:xfrm>
+                    <a:prstGeom prst="rect">
+                      <a:avLst/>
+                    </a:prstGeom>
+                  </pic:spPr>
+                </pic:pic>
+              </a:graphicData>
+            </a:graphic>
+          </wp:inline>
+        </w:drawing>
+      </w:r>
+    </w:p>
+    <w:p>
+      <w:pPr>
+        <w:pStyle w:val="ab"/>
+        <w:rPr>
+          <w:lang w:val="en-US"/>
+        </w:rPr>
+      </w:pPr>
+      <w:r>
+        <w:t xml:space="preserve">Рисунок </w:t>
+      </w:r>
+      <w:r>
+        <w:fldChar w:fldCharType="begin"/>
+      </w:r>
+      <w:r>
+        <w:instrText xml:space="preserve"> SEQ Рисунок \* ARABIC </w:instrText>
+      </w:r>
+      <w:r>
+        <w:fldChar w:fldCharType="separate"/>
+      </w:r>
+      <w:r>
+        <w:rPr>
+          <w:noProof/>
+        </w:rPr>
+        <w:t>17</w:t>
+      </w:r>
+      <w:r>
+        <w:fldChar w:fldCharType="end"/>
+      </w:r>
+      <w:r>
+        <w:t xml:space="preserve"> – Медленный </w:t>
+      </w:r>
+      <w:r>
+        <w:t>поиск</w:t>
+      </w:r>
+    </w:p>
+    <w:p>
+      <w:pPr>
         <w:pStyle w:val="a4"/>
         <w:rPr>
           <w:lang w:val="en-US"/>
         </w:rPr>
       </w:pPr>
+      <w:r>
+        <w:rPr>
+          <w:b/>
+          <w:bCs/>
+        </w:rPr>
+        <w:t>Тип</w:t>
+      </w:r>
+      <w:r>
+        <w:rPr>
+          <w:b/>
+          <w:bCs/>
+          <w:lang w:val="en-US"/>
+        </w:rPr>
+        <w:t xml:space="preserve"> </w:t>
+      </w:r>
+      <w:r>
+        <w:rPr>
+          <w:b/>
+          <w:bCs/>
+        </w:rPr>
+        <w:t>плана</w:t>
+      </w:r>
+      <w:r>
+        <w:rPr>
+          <w:lang w:val="en-US"/>
+        </w:rPr>
+        <w:t xml:space="preserve"> – Seq Scan.</w:t>
+      </w:r>
+    </w:p>
+    <w:p>
+      <w:pPr>
+        <w:pStyle w:val="a4"/>
+        <w:rPr>
+          <w:lang w:val="en-US"/>
+        </w:rPr>
+      </w:pPr>
+      <w:r>
+        <w:rPr>
+          <w:b/>
+          <w:bCs/>
+        </w:rPr>
+        <w:t>Время</w:t>
+      </w:r>
+      <w:r>
+        <w:rPr>
+          <w:b/>
+          <w:bCs/>
+          <w:lang w:val="en-US"/>
+        </w:rPr>
+        <w:t xml:space="preserve"> </w:t>
+      </w:r>
+      <w:r>
+        <w:rPr>
+          <w:b/>
+          <w:bCs/>
+        </w:rPr>
+        <w:t>выполнения</w:t>
+      </w:r>
+      <w:r>
+        <w:rPr>
+          <w:lang w:val="en-US"/>
+        </w:rPr>
+        <w:t xml:space="preserve"> – Execution Time: </w:t>
+      </w:r>
+      <w:r>
+        <w:rPr>
+          <w:lang w:val="en-US"/>
+        </w:rPr>
+        <w:t>4.391</w:t>
+      </w:r>
+      <w:r>
+        <w:rPr>
+          <w:lang w:val="en-US"/>
+        </w:rPr>
+        <w:t xml:space="preserve"> ms.  </w:t>
+      </w:r>
+    </w:p>
+    <w:p>
+      <w:pPr>
+        <w:pStyle w:val="a4"/>
+      </w:pPr>
+      <w:r>
+        <w:t>Это время будет линейно расти с увеличением таблицы.</w:t>
+      </w:r>
+    </w:p>
+    <w:p>
+      <w:pPr>
+        <w:pStyle w:val="aa"/>
+        <w:keepNext/>
+      </w:pPr>
+      <w:r>
+        <w:rPr>
+          <w:lang w:val="en-US"/>
+        </w:rPr>
+        <w:drawing>
+          <wp:inline distT="0" distB="0" distL="0" distR="0" wp14:anchorId="4F3F71DC" wp14:editId="7D8F06FE">
+            <wp:extent cx="5762338" cy="2876550"/>
+            <wp:effectExtent l="0" t="0" r="0" b="0"/>
+            <wp:docPr id="8" name="Рисунок 8"/>
+            <wp:cNvGraphicFramePr>
+              <a:graphicFrameLocks xmlns:a="http://schemas.openxmlformats.org/drawingml/2006/main" noChangeAspect="1"/>
+            </wp:cNvGraphicFramePr>
+            <a:graphic xmlns:a="http://schemas.openxmlformats.org/drawingml/2006/main">
+              <a:graphicData uri="http://schemas.openxmlformats.org/drawingml/2006/picture">
+                <pic:pic xmlns:pic="http://schemas.openxmlformats.org/drawingml/2006/picture">
+                  <pic:nvPicPr>
+                    <pic:cNvPr id="1" name=""/>
+                    <pic:cNvPicPr/>
+                  </pic:nvPicPr>
+                  <pic:blipFill>
+                    <a:blip r:embed="rId27"/>
+                    <a:stretch>
+                      <a:fillRect/>
+                    </a:stretch>
+                  </pic:blipFill>
+                  <pic:spPr>
+                    <a:xfrm>
+                      <a:off x="0" y="0"/>
+                      <a:ext cx="5779210" cy="2884973"/>
+                    </a:xfrm>
+                    <a:prstGeom prst="rect">
+                      <a:avLst/>
+                    </a:prstGeom>
+                  </pic:spPr>
+                </pic:pic>
+              </a:graphicData>
+            </a:graphic>
+          </wp:inline>
+        </w:drawing>
+      </w:r>
+    </w:p>
+    <w:p>
+      <w:pPr>
+        <w:pStyle w:val="ab"/>
+      </w:pPr>
+      <w:r>
+        <w:t xml:space="preserve">Рисунок </w:t>
+      </w:r>
+      <w:r>
+        <w:fldChar w:fldCharType="begin"/>
+      </w:r>
+      <w:r>
+        <w:instrText xml:space="preserve"> SEQ Рисунок \* ARABIC </w:instrText>
+      </w:r>
+      <w:r>
+        <w:fldChar w:fldCharType="separate"/>
+      </w:r>
+      <w:r>
+        <w:rPr>
+          <w:noProof/>
+        </w:rPr>
+        <w:t>18</w:t>
+      </w:r>
+      <w:r>
+        <w:fldChar w:fldCharType="end"/>
+      </w:r>
+      <w:r>
+        <w:t xml:space="preserve"> – </w:t>
+      </w:r>
+      <w:r>
+        <w:t>Создание индекса</w:t>
+      </w:r>
+      <w:r>
+        <w:t xml:space="preserve"> для первого сценария</w:t>
+      </w:r>
+    </w:p>
+    <w:p>
+      <w:pPr>
+        <w:pStyle w:val="aa"/>
+        <w:keepNext/>
+      </w:pPr>
+      <w:r>
+        <w:lastRenderedPageBreak/>
+        <w:drawing>
+          <wp:inline distT="0" distB="0" distL="0" distR="0" wp14:anchorId="5FA983B3" wp14:editId="4838367C">
+            <wp:extent cx="5867661" cy="2406650"/>
+            <wp:effectExtent l="0" t="0" r="0" b="0"/>
+            <wp:docPr id="11" name="Рисунок 11"/>
+            <wp:cNvGraphicFramePr>
+              <a:graphicFrameLocks xmlns:a="http://schemas.openxmlformats.org/drawingml/2006/main" noChangeAspect="1"/>
+            </wp:cNvGraphicFramePr>
+            <a:graphic xmlns:a="http://schemas.openxmlformats.org/drawingml/2006/main">
+              <a:graphicData uri="http://schemas.openxmlformats.org/drawingml/2006/picture">
+                <pic:pic xmlns:pic="http://schemas.openxmlformats.org/drawingml/2006/picture">
+                  <pic:nvPicPr>
+                    <pic:cNvPr id="1" name=""/>
+                    <pic:cNvPicPr/>
+                  </pic:nvPicPr>
+                  <pic:blipFill>
+                    <a:blip r:embed="rId28"/>
+                    <a:stretch>
+                      <a:fillRect/>
+                    </a:stretch>
+                  </pic:blipFill>
+                  <pic:spPr>
+                    <a:xfrm>
+                      <a:off x="0" y="0"/>
+                      <a:ext cx="5883231" cy="2413036"/>
+                    </a:xfrm>
+                    <a:prstGeom prst="rect">
+                      <a:avLst/>
+                    </a:prstGeom>
+                  </pic:spPr>
+                </pic:pic>
+              </a:graphicData>
+            </a:graphic>
+          </wp:inline>
+        </w:drawing>
+      </w:r>
+    </w:p>
+    <w:p>
+      <w:pPr>
+        <w:pStyle w:val="ab"/>
+      </w:pPr>
+      <w:r>
+        <w:t xml:space="preserve">Рисунок </w:t>
+      </w:r>
+      <w:r>
+        <w:fldChar w:fldCharType="begin"/>
+      </w:r>
+      <w:r>
+        <w:instrText xml:space="preserve"> SEQ Рисунок \* ARABIC </w:instrText>
+      </w:r>
+      <w:r>
+        <w:fldChar w:fldCharType="separate"/>
+      </w:r>
+      <w:r>
+        <w:rPr>
+          <w:noProof/>
+        </w:rPr>
+        <w:t>19</w:t>
+      </w:r>
+      <w:r>
+        <w:fldChar w:fldCharType="end"/>
+      </w:r>
+      <w:r>
+        <w:t xml:space="preserve"> – Оптимизированный поиск</w:t>
+      </w:r>
+    </w:p>
+    <w:p>
+      <w:pPr>
+        <w:pStyle w:val="a4"/>
+      </w:pPr>
+      <w:r>
+        <w:rPr>
+          <w:b/>
+          <w:bCs/>
+        </w:rPr>
+        <w:t>Тип плана</w:t>
+      </w:r>
+      <w:r>
+        <w:t xml:space="preserve"> – Index Scan.</w:t>
+      </w:r>
+    </w:p>
+    <w:p>
+      <w:pPr>
+        <w:pStyle w:val="a4"/>
+        <w:rPr>
+          <w:lang w:val="en-US"/>
+        </w:rPr>
+      </w:pPr>
+      <w:r>
+        <w:rPr>
+          <w:b/>
+          <w:bCs/>
+        </w:rPr>
+        <w:t>Время</w:t>
+      </w:r>
+      <w:r>
+        <w:rPr>
+          <w:b/>
+          <w:bCs/>
+          <w:lang w:val="en-US"/>
+        </w:rPr>
+        <w:t xml:space="preserve"> </w:t>
+      </w:r>
+      <w:r>
+        <w:rPr>
+          <w:b/>
+          <w:bCs/>
+        </w:rPr>
+        <w:t>выполнения</w:t>
+      </w:r>
+      <w:r>
+        <w:rPr>
+          <w:lang w:val="en-US"/>
+        </w:rPr>
+        <w:t xml:space="preserve"> – Execution Time: 0.</w:t>
+      </w:r>
+      <w:r>
+        <w:rPr>
+          <w:lang w:val="en-US"/>
+        </w:rPr>
+        <w:t>122</w:t>
+      </w:r>
+      <w:r>
+        <w:rPr>
+          <w:lang w:val="en-US"/>
+        </w:rPr>
+        <w:t xml:space="preserve"> ms.  </w:t>
+      </w:r>
+    </w:p>
+    <w:p>
+      <w:pPr>
+        <w:pStyle w:val="a4"/>
+      </w:pPr>
+      <w:r>
+        <w:t>Это время будет незначительно расти с увеличением таблицы.</w:t>
+      </w:r>
+    </w:p>
+    <w:p>
+      <w:pPr>
+        <w:pStyle w:val="ad"/>
+      </w:pPr>
+      <w:r>
+        <w:t xml:space="preserve">Таблица </w:t>
+      </w:r>
+      <w:r>
+        <w:fldChar w:fldCharType="begin"/>
+      </w:r>
+      <w:r>
+        <w:instrText xml:space="preserve"> SEQ Таблица \* ARABIC </w:instrText>
+      </w:r>
+      <w:r>
+        <w:fldChar w:fldCharType="separate"/>
+      </w:r>
+      <w:r>
+        <w:rPr>
+          <w:noProof/>
+        </w:rPr>
+        <w:t>1</w:t>
+      </w:r>
+      <w:r>
+        <w:fldChar w:fldCharType="end"/>
+      </w:r>
+      <w:r>
+        <w:t xml:space="preserve"> – </w:t>
+      </w:r>
+      <w:r>
+        <w:t>Сравнительная таблица для первого сценария</w:t>
+      </w:r>
+    </w:p>
+    <w:tbl>
+      <w:tblPr>
+        <w:tblStyle w:val="ac"/>
+        <w:tblW w:w="9351" w:type="dxa"/>
+        <w:tblLook w:val="04A0" w:firstRow="1" w:lastRow="0" w:firstColumn="1" w:lastColumn="0" w:noHBand="0" w:noVBand="1"/>
+      </w:tblPr>
+      <w:tblGrid>
+        <w:gridCol w:w="2336"/>
+        <w:gridCol w:w="2336"/>
+        <w:gridCol w:w="2411"/>
+        <w:gridCol w:w="2268"/>
+      </w:tblGrid>
+      <w:tr>
+        <w:tc>
+          <w:tcPr>
+            <w:tcW w:w="2336" w:type="dxa"/>
+          </w:tcPr>
+          <w:p>
+            <w:pPr>
+              <w:pStyle w:val="ae"/>
+              <w:rPr>
+                <w:b/>
+                <w:bCs/>
+              </w:rPr>
+            </w:pPr>
+            <w:r>
+              <w:rPr>
+                <w:b/>
+                <w:bCs/>
+              </w:rPr>
+              <w:t>Метрика</w:t>
+            </w:r>
+          </w:p>
+        </w:tc>
+        <w:tc>
+          <w:tcPr>
+            <w:tcW w:w="2336" w:type="dxa"/>
+          </w:tcPr>
+          <w:p>
+            <w:pPr>
+              <w:pStyle w:val="ae"/>
+              <w:rPr>
+                <w:b/>
+                <w:bCs/>
+              </w:rPr>
+            </w:pPr>
+            <w:r>
+              <w:rPr>
+                <w:b/>
+                <w:bCs/>
+              </w:rPr>
+              <w:t>До оптимизации</w:t>
+            </w:r>
+          </w:p>
+        </w:tc>
+        <w:tc>
+          <w:tcPr>
+            <w:tcW w:w="2411" w:type="dxa"/>
+          </w:tcPr>
+          <w:p>
+            <w:pPr>
+              <w:pStyle w:val="ae"/>
+              <w:rPr>
+                <w:b/>
+                <w:bCs/>
+              </w:rPr>
+            </w:pPr>
+            <w:r>
+              <w:rPr>
+                <w:b/>
+                <w:bCs/>
+              </w:rPr>
+              <w:t>После оптимизации</w:t>
+            </w:r>
+          </w:p>
+        </w:tc>
+        <w:tc>
+          <w:tcPr>
+            <w:tcW w:w="2268" w:type="dxa"/>
+          </w:tcPr>
+          <w:p>
+            <w:pPr>
+              <w:pStyle w:val="ae"/>
+              <w:rPr>
+                <w:b/>
+                <w:bCs/>
+              </w:rPr>
+            </w:pPr>
+            <w:r>
+              <w:rPr>
+                <w:b/>
+                <w:bCs/>
+              </w:rPr>
+              <w:t>Вывод</w:t>
+            </w:r>
+          </w:p>
+        </w:tc>
+      </w:tr>
+      <w:tr>
+        <w:tc>
+          <w:tcPr>
+            <w:tcW w:w="2336" w:type="dxa"/>
+          </w:tcPr>
+          <w:p>
+            <w:pPr>
+              <w:pStyle w:val="ae"/>
+            </w:pPr>
+            <w:r>
+              <w:t>План (Оператор)</w:t>
+            </w:r>
+          </w:p>
+        </w:tc>
+        <w:tc>
+          <w:tcPr>
+            <w:tcW w:w="2336" w:type="dxa"/>
+          </w:tcPr>
+          <w:p>
+            <w:pPr>
+              <w:pStyle w:val="ae"/>
+              <w:rPr>
+                <w:lang w:val="en-US"/>
+              </w:rPr>
+            </w:pPr>
+            <w:r>
+              <w:rPr>
+                <w:lang w:val="en-US"/>
+              </w:rPr>
+              <w:t>Seq Scan</w:t>
+            </w:r>
+          </w:p>
+        </w:tc>
+        <w:tc>
+          <w:tcPr>
+            <w:tcW w:w="2411" w:type="dxa"/>
+          </w:tcPr>
+          <w:p>
+            <w:pPr>
+              <w:pStyle w:val="ae"/>
+              <w:rPr>
+                <w:lang w:val="en-US"/>
+              </w:rPr>
+            </w:pPr>
+            <w:r>
+              <w:rPr>
+                <w:lang w:val="en-US"/>
+              </w:rPr>
+              <w:t>Index Scan</w:t>
+            </w:r>
+          </w:p>
+        </w:tc>
+        <w:tc>
+          <w:tcPr>
+            <w:tcW w:w="2268" w:type="dxa"/>
+          </w:tcPr>
+          <w:p>
+            <w:pPr>
+              <w:pStyle w:val="ae"/>
+            </w:pPr>
+            <w:r>
+              <w:t>Выбор отличается</w:t>
+            </w:r>
+          </w:p>
+        </w:tc>
+      </w:tr>
+      <w:tr>
+        <w:tc>
+          <w:tcPr>
+            <w:tcW w:w="2336" w:type="dxa"/>
+          </w:tcPr>
+          <w:p>
+            <w:pPr>
+              <w:pStyle w:val="ae"/>
+              <w:rPr>
+                <w:lang w:val="en-US"/>
+              </w:rPr>
+            </w:pPr>
+            <w:r>
+              <w:rPr>
+                <w:lang w:val="en-US"/>
+              </w:rPr>
+              <w:t>Execution Time</w:t>
+            </w:r>
+          </w:p>
+        </w:tc>
+        <w:tc>
+          <w:tcPr>
+            <w:tcW w:w="2336" w:type="dxa"/>
+          </w:tcPr>
+          <w:p>
+            <w:pPr>
+              <w:pStyle w:val="ae"/>
+              <w:rPr>
+                <w:lang w:val="en-US"/>
+              </w:rPr>
+            </w:pPr>
+            <w:r>
+              <w:t xml:space="preserve">4.391 </w:t>
+            </w:r>
+            <w:r>
+              <w:rPr>
+                <w:lang w:val="en-US"/>
+              </w:rPr>
+              <w:t>ms</w:t>
+            </w:r>
+          </w:p>
+        </w:tc>
+        <w:tc>
+          <w:tcPr>
+            <w:tcW w:w="2411" w:type="dxa"/>
+          </w:tcPr>
+          <w:p>
+            <w:pPr>
+              <w:pStyle w:val="ae"/>
+              <w:rPr>
+                <w:lang w:val="en-US"/>
+              </w:rPr>
+            </w:pPr>
+            <w:r>
+              <w:rPr>
+                <w:lang w:val="en-US"/>
+              </w:rPr>
+              <w:t>0.122 ms</w:t>
+            </w:r>
+          </w:p>
+        </w:tc>
+        <w:tc>
+          <w:tcPr>
+            <w:tcW w:w="2268" w:type="dxa"/>
+          </w:tcPr>
+          <w:p>
+            <w:pPr>
+              <w:pStyle w:val="ae"/>
+            </w:pPr>
+            <w:r>
+              <w:t xml:space="preserve">Запрос ускорился примерно в </w:t>
+            </w:r>
+            <w:r>
+              <w:t>3</w:t>
+            </w:r>
+            <w:r>
+              <w:t>6 раз</w:t>
+            </w:r>
+          </w:p>
+        </w:tc>
+      </w:tr>
+    </w:tbl>
+    <w:p>
+      <w:pPr>
+        <w:pStyle w:val="4"/>
+      </w:pPr>
+      <w:r>
+        <w:t>Поиск в любом регистре</w:t>
+      </w:r>
+    </w:p>
+    <w:p>
+      <w:pPr>
+        <w:pStyle w:val="aa"/>
+        <w:keepNext/>
+      </w:pPr>
+      <w:r>
+        <w:drawing>
+          <wp:inline distT="0" distB="0" distL="0" distR="0" wp14:anchorId="42D3541B" wp14:editId="486F3494">
+            <wp:extent cx="5940425" cy="2303780"/>
+            <wp:effectExtent l="0" t="0" r="3175" b="1270"/>
+            <wp:docPr id="12" name="Рисунок 12"/>
+            <wp:cNvGraphicFramePr>
+              <a:graphicFrameLocks xmlns:a="http://schemas.openxmlformats.org/drawingml/2006/main" noChangeAspect="1"/>
+            </wp:cNvGraphicFramePr>
+            <a:graphic xmlns:a="http://schemas.openxmlformats.org/drawingml/2006/main">
+              <a:graphicData uri="http://schemas.openxmlformats.org/drawingml/2006/picture">
+                <pic:pic xmlns:pic="http://schemas.openxmlformats.org/drawingml/2006/picture">
+                  <pic:nvPicPr>
+                    <pic:cNvPr id="1" name=""/>
+                    <pic:cNvPicPr/>
+                  </pic:nvPicPr>
+                  <pic:blipFill>
+                    <a:blip r:embed="rId29"/>
+                    <a:stretch>
+                      <a:fillRect/>
+                    </a:stretch>
+                  </pic:blipFill>
+                  <pic:spPr>
+                    <a:xfrm>
+                      <a:off x="0" y="0"/>
+                      <a:ext cx="5940425" cy="2303780"/>
+                    </a:xfrm>
+                    <a:prstGeom prst="rect">
+                      <a:avLst/>
+                    </a:prstGeom>
+                  </pic:spPr>
+                </pic:pic>
+              </a:graphicData>
+            </a:graphic>
+          </wp:inline>
+        </w:drawing>
+      </w:r>
+    </w:p>
+    <w:p>
+      <w:pPr>
+        <w:pStyle w:val="ab"/>
+      </w:pPr>
+      <w:r>
+        <w:t xml:space="preserve">Рисунок </w:t>
+      </w:r>
+      <w:r>
+        <w:fldChar w:fldCharType="begin"/>
+      </w:r>
+      <w:r>
+        <w:instrText xml:space="preserve"> SEQ Рисунок \* ARABIC </w:instrText>
+      </w:r>
+      <w:r>
+        <w:fldChar w:fldCharType="separate"/>
+      </w:r>
+      <w:r>
+        <w:rPr>
+          <w:noProof/>
+        </w:rPr>
+        <w:t>20</w:t>
+      </w:r>
+      <w:r>
+        <w:fldChar w:fldCharType="end"/>
+      </w:r>
+      <w:r>
+        <w:t xml:space="preserve"> – Медленный поиск в любом регистре</w:t>
+      </w:r>
+    </w:p>
+    <w:p>
+      <w:pPr>
+        <w:pStyle w:val="a4"/>
+      </w:pPr>
+      <w:r>
+        <w:rPr>
+          <w:b/>
+          <w:bCs/>
+        </w:rPr>
+        <w:t>Тип</w:t>
+      </w:r>
+      <w:r>
+        <w:rPr>
+          <w:b/>
+          <w:bCs/>
+        </w:rPr>
+        <w:t xml:space="preserve"> </w:t>
+      </w:r>
+      <w:r>
+        <w:rPr>
+          <w:b/>
+          <w:bCs/>
+        </w:rPr>
+        <w:t>плана</w:t>
+      </w:r>
+      <w:r>
+        <w:t xml:space="preserve"> – </w:t>
+      </w:r>
+      <w:r>
+        <w:rPr>
+          <w:lang w:val="en-US"/>
+        </w:rPr>
+        <w:t>Seq</w:t>
+      </w:r>
+      <w:r>
+        <w:t xml:space="preserve"> </w:t>
+      </w:r>
+      <w:r>
+        <w:rPr>
+          <w:lang w:val="en-US"/>
+        </w:rPr>
+        <w:t>Scan</w:t>
+      </w:r>
+      <w:r>
+        <w:t>.</w:t>
+      </w:r>
+    </w:p>
+    <w:p>
+      <w:pPr>
+        <w:pStyle w:val="a4"/>
+        <w:rPr>
+          <w:lang w:val="en-US"/>
+        </w:rPr>
+      </w:pPr>
+      <w:r>
+        <w:rPr>
+          <w:b/>
+          <w:bCs/>
+        </w:rPr>
+        <w:t>Время</w:t>
+      </w:r>
+      <w:r>
+        <w:rPr>
+          <w:b/>
+          <w:bCs/>
+          <w:lang w:val="en-US"/>
+        </w:rPr>
+        <w:t xml:space="preserve"> </w:t>
+      </w:r>
+      <w:r>
+        <w:rPr>
+          <w:b/>
+          <w:bCs/>
+        </w:rPr>
+        <w:t>выполнения</w:t>
+      </w:r>
+      <w:r>
+        <w:rPr>
+          <w:lang w:val="en-US"/>
+        </w:rPr>
+        <w:t xml:space="preserve"> – </w:t>
+      </w:r>
+      <w:r>
+        <w:rPr>
+          <w:lang w:val="en-US"/>
+        </w:rPr>
+        <w:t>Execution</w:t>
+      </w:r>
+      <w:r>
+        <w:rPr>
+          <w:lang w:val="en-US"/>
+        </w:rPr>
+        <w:t xml:space="preserve"> </w:t>
+      </w:r>
+      <w:r>
+        <w:rPr>
+          <w:lang w:val="en-US"/>
+        </w:rPr>
+        <w:t>Time</w:t>
+      </w:r>
+      <w:r>
+        <w:rPr>
+          <w:lang w:val="en-US"/>
+        </w:rPr>
+        <w:t xml:space="preserve">: </w:t>
+      </w:r>
+      <w:r>
+        <w:rPr>
+          <w:lang w:val="en-US"/>
+        </w:rPr>
+        <w:t>17.922</w:t>
+      </w:r>
+      <w:r>
+        <w:rPr>
+          <w:lang w:val="en-US"/>
+        </w:rPr>
+        <w:t xml:space="preserve"> </w:t>
+      </w:r>
+      <w:r>
+        <w:rPr>
+          <w:lang w:val="en-US"/>
+        </w:rPr>
+        <w:t>ms</w:t>
+      </w:r>
+      <w:r>
+        <w:rPr>
+          <w:lang w:val="en-US"/>
+        </w:rPr>
+        <w:t xml:space="preserve">.  </w:t>
+      </w:r>
+    </w:p>
+    <w:p>
+      <w:pPr>
+        <w:pStyle w:val="a4"/>
+      </w:pPr>
+      <w:r>
+        <w:t>Это время будет линейно расти с увеличением таблицы.</w:t>
+      </w:r>
+    </w:p>
+    <w:p>
+      <w:pPr>
+        <w:pStyle w:val="aa"/>
+        <w:keepNext/>
+      </w:pPr>
+      <w:r>
+        <w:lastRenderedPageBreak/>
+        <w:drawing>
+          <wp:inline distT="0" distB="0" distL="0" distR="0" wp14:anchorId="72C9FD46" wp14:editId="15B09EBE">
+            <wp:extent cx="5940425" cy="2294890"/>
+            <wp:effectExtent l="0" t="0" r="3175" b="0"/>
+            <wp:docPr id="13" name="Рисунок 13"/>
+            <wp:cNvGraphicFramePr>
+              <a:graphicFrameLocks xmlns:a="http://schemas.openxmlformats.org/drawingml/2006/main" noChangeAspect="1"/>
+            </wp:cNvGraphicFramePr>
+            <a:graphic xmlns:a="http://schemas.openxmlformats.org/drawingml/2006/main">
+              <a:graphicData uri="http://schemas.openxmlformats.org/drawingml/2006/picture">
+                <pic:pic xmlns:pic="http://schemas.openxmlformats.org/drawingml/2006/picture">
+                  <pic:nvPicPr>
+                    <pic:cNvPr id="1" name=""/>
+                    <pic:cNvPicPr/>
+                  </pic:nvPicPr>
+                  <pic:blipFill>
+                    <a:blip r:embed="rId30"/>
+                    <a:stretch>
+                      <a:fillRect/>
+                    </a:stretch>
+                  </pic:blipFill>
+                  <pic:spPr>
+                    <a:xfrm>
+                      <a:off x="0" y="0"/>
+                      <a:ext cx="5940425" cy="2294890"/>
+                    </a:xfrm>
+                    <a:prstGeom prst="rect">
+                      <a:avLst/>
+                    </a:prstGeom>
+                  </pic:spPr>
+                </pic:pic>
+              </a:graphicData>
+            </a:graphic>
+          </wp:inline>
+        </w:drawing>
+      </w:r>
+    </w:p>
+    <w:p>
+      <w:pPr>
+        <w:pStyle w:val="ab"/>
+      </w:pPr>
+      <w:r>
+        <w:t xml:space="preserve">Рисунок </w:t>
+      </w:r>
+      <w:r>
+        <w:fldChar w:fldCharType="begin"/>
+      </w:r>
+      <w:r>
+        <w:instrText xml:space="preserve"> SEQ Рисунок \* ARABIC </w:instrText>
+      </w:r>
+      <w:r>
+        <w:fldChar w:fldCharType="separate"/>
+      </w:r>
+      <w:r>
+        <w:rPr>
+          <w:noProof/>
+        </w:rPr>
+        <w:t>21</w:t>
+      </w:r>
+      <w:r>
+        <w:fldChar w:fldCharType="end"/>
+      </w:r>
+      <w:r>
+        <w:t xml:space="preserve"> – Создание индекса для второго сценария</w:t>
+      </w:r>
+    </w:p>
+    <w:p>
+      <w:pPr>
+        <w:pStyle w:val="aa"/>
+        <w:keepNext/>
+      </w:pPr>
+      <w:r>
+        <w:drawing>
+          <wp:inline distT="0" distB="0" distL="0" distR="0" wp14:anchorId="4ED01E98" wp14:editId="2E8F2A53">
+            <wp:extent cx="5940425" cy="2594610"/>
+            <wp:effectExtent l="0" t="0" r="3175" b="0"/>
+            <wp:docPr id="14" name="Рисунок 14"/>
+            <wp:cNvGraphicFramePr>
+              <a:graphicFrameLocks xmlns:a="http://schemas.openxmlformats.org/drawingml/2006/main" noChangeAspect="1"/>
+            </wp:cNvGraphicFramePr>
+            <a:graphic xmlns:a="http://schemas.openxmlformats.org/drawingml/2006/main">
+              <a:graphicData uri="http://schemas.openxmlformats.org/drawingml/2006/picture">
+                <pic:pic xmlns:pic="http://schemas.openxmlformats.org/drawingml/2006/picture">
+                  <pic:nvPicPr>
+                    <pic:cNvPr id="1" name=""/>
+                    <pic:cNvPicPr/>
+                  </pic:nvPicPr>
+                  <pic:blipFill>
+                    <a:blip r:embed="rId31"/>
+                    <a:stretch>
+                      <a:fillRect/>
+                    </a:stretch>
+                  </pic:blipFill>
+                  <pic:spPr>
+                    <a:xfrm>
+                      <a:off x="0" y="0"/>
+                      <a:ext cx="5940425" cy="2594610"/>
+                    </a:xfrm>
+                    <a:prstGeom prst="rect">
+                      <a:avLst/>
+                    </a:prstGeom>
+                  </pic:spPr>
+                </pic:pic>
+              </a:graphicData>
+            </a:graphic>
+          </wp:inline>
+        </w:drawing>
+      </w:r>
+    </w:p>
+    <w:p>
+      <w:pPr>
+        <w:pStyle w:val="ab"/>
+      </w:pPr>
+      <w:r>
+        <w:t xml:space="preserve">Рисунок </w:t>
+      </w:r>
+      <w:r>
+        <w:fldChar w:fldCharType="begin"/>
+      </w:r>
+      <w:r>
+        <w:instrText xml:space="preserve"> SEQ Рисунок \* ARABIC </w:instrText>
+      </w:r>
+      <w:r>
+        <w:fldChar w:fldCharType="separate"/>
+      </w:r>
+      <w:r>
+        <w:rPr>
+          <w:noProof/>
+        </w:rPr>
+        <w:t>22</w:t>
+      </w:r>
+      <w:r>
+        <w:fldChar w:fldCharType="end"/>
+      </w:r>
+      <w:r>
+        <w:t xml:space="preserve"> – Оптимизированный поиск в любом регистре</w:t>
+      </w:r>
+    </w:p>
+    <w:p>
+      <w:pPr>
+        <w:pStyle w:val="a4"/>
+        <w:rPr>
+          <w:lang w:val="en-US"/>
+        </w:rPr>
+      </w:pPr>
+      <w:r>
+        <w:rPr>
+          <w:b/>
+          <w:bCs/>
+        </w:rPr>
+        <w:t>Тип</w:t>
+      </w:r>
+      <w:r>
+        <w:rPr>
+          <w:b/>
+          <w:bCs/>
+          <w:lang w:val="en-US"/>
+        </w:rPr>
+        <w:t xml:space="preserve"> </w:t>
+      </w:r>
+      <w:r>
+        <w:rPr>
+          <w:b/>
+          <w:bCs/>
+        </w:rPr>
+        <w:t>плана</w:t>
+      </w:r>
+      <w:r>
+        <w:rPr>
+          <w:lang w:val="en-US"/>
+        </w:rPr>
+        <w:t xml:space="preserve"> – </w:t>
+      </w:r>
+      <w:r>
+        <w:rPr>
+          <w:lang w:val="en-US"/>
+        </w:rPr>
+        <w:t>Bitmap Heap</w:t>
+      </w:r>
+      <w:r>
+        <w:rPr>
+          <w:lang w:val="en-US"/>
+        </w:rPr>
+        <w:t xml:space="preserve"> </w:t>
+      </w:r>
+      <w:r>
+        <w:rPr>
+          <w:lang w:val="en-US"/>
+        </w:rPr>
+        <w:t>Scan</w:t>
+      </w:r>
+      <w:r>
+        <w:rPr>
+          <w:lang w:val="en-US"/>
+        </w:rPr>
+        <w:t>.</w:t>
+      </w:r>
+    </w:p>
+    <w:p>
+      <w:pPr>
+        <w:pStyle w:val="a4"/>
+        <w:rPr>
+          <w:lang w:val="en-US"/>
+        </w:rPr>
+      </w:pPr>
+      <w:r>
+        <w:rPr>
+          <w:b/>
+          <w:bCs/>
+        </w:rPr>
+        <w:t>Время</w:t>
+      </w:r>
+      <w:r>
+        <w:rPr>
+          <w:b/>
+          <w:bCs/>
+          <w:lang w:val="en-US"/>
+        </w:rPr>
+        <w:t xml:space="preserve"> </w:t>
+      </w:r>
+      <w:r>
+        <w:rPr>
+          <w:b/>
+          <w:bCs/>
+        </w:rPr>
+        <w:t>выполнения</w:t>
+      </w:r>
+      <w:r>
+        <w:rPr>
+          <w:lang w:val="en-US"/>
+        </w:rPr>
+        <w:t xml:space="preserve"> – </w:t>
+      </w:r>
+      <w:r>
+        <w:rPr>
+          <w:lang w:val="en-US"/>
+        </w:rPr>
+        <w:t>Execution</w:t>
+      </w:r>
+      <w:r>
+        <w:rPr>
+          <w:lang w:val="en-US"/>
+        </w:rPr>
+        <w:t xml:space="preserve"> </w:t>
+      </w:r>
+      <w:r>
+        <w:rPr>
+          <w:lang w:val="en-US"/>
+        </w:rPr>
+        <w:t>Time</w:t>
+      </w:r>
+      <w:r>
+        <w:rPr>
+          <w:lang w:val="en-US"/>
+        </w:rPr>
+        <w:t xml:space="preserve">: </w:t>
+      </w:r>
+      <w:r>
+        <w:rPr>
+          <w:lang w:val="en-US"/>
+        </w:rPr>
+        <w:t>0.128</w:t>
+      </w:r>
+      <w:r>
+        <w:rPr>
+          <w:lang w:val="en-US"/>
+        </w:rPr>
+        <w:t xml:space="preserve"> </w:t>
+      </w:r>
+      <w:r>
+        <w:rPr>
+          <w:lang w:val="en-US"/>
+        </w:rPr>
+        <w:t>ms</w:t>
+      </w:r>
+      <w:r>
+        <w:rPr>
+          <w:lang w:val="en-US"/>
+        </w:rPr>
+        <w:t xml:space="preserve">.  </w:t>
+      </w:r>
+    </w:p>
+    <w:p>
+      <w:pPr>
+        <w:pStyle w:val="a4"/>
+      </w:pPr>
+      <w:r>
+        <w:t xml:space="preserve">Это время будет </w:t>
+      </w:r>
+      <w:r>
+        <w:t>незначительно</w:t>
+      </w:r>
+      <w:r>
+        <w:t xml:space="preserve"> расти с увеличением таблицы.</w:t>
+      </w:r>
+    </w:p>
+    <w:p>
+      <w:pPr>
+        <w:pStyle w:val="ad"/>
+      </w:pPr>
+      <w:r>
+        <w:t xml:space="preserve">Таблица </w:t>
+      </w:r>
+      <w:r>
+        <w:fldChar w:fldCharType="begin"/>
+      </w:r>
+      <w:r>
+        <w:instrText xml:space="preserve"> SEQ Таблица \* ARABIC </w:instrText>
+      </w:r>
+      <w:r>
+        <w:fldChar w:fldCharType="separate"/>
+      </w:r>
+      <w:r>
+        <w:rPr>
+          <w:noProof/>
+        </w:rPr>
+        <w:t>2</w:t>
+      </w:r>
+      <w:r>
+        <w:fldChar w:fldCharType="end"/>
+      </w:r>
+      <w:r>
+        <w:t xml:space="preserve"> – </w:t>
+      </w:r>
+      <w:r>
+        <w:t xml:space="preserve">Сравнительная таблица для </w:t>
+      </w:r>
+      <w:r>
+        <w:t>второго</w:t>
+      </w:r>
+      <w:r>
+        <w:t xml:space="preserve"> сценария</w:t>
+      </w:r>
+    </w:p>
+    <w:tbl>
+      <w:tblPr>
+        <w:tblStyle w:val="ac"/>
+        <w:tblW w:w="9351" w:type="dxa"/>
+        <w:tblLook w:val="04A0" w:firstRow="1" w:lastRow="0" w:firstColumn="1" w:lastColumn="0" w:noHBand="0" w:noVBand="1"/>
+      </w:tblPr>
+      <w:tblGrid>
+        <w:gridCol w:w="2336"/>
+        <w:gridCol w:w="2336"/>
+        <w:gridCol w:w="2411"/>
+        <w:gridCol w:w="2268"/>
+      </w:tblGrid>
+      <w:tr>
+        <w:tc>
+          <w:tcPr>
+            <w:tcW w:w="2336" w:type="dxa"/>
+          </w:tcPr>
+          <w:p>
+            <w:pPr>
+              <w:pStyle w:val="ae"/>
+              <w:rPr>
+                <w:b/>
+                <w:bCs/>
+              </w:rPr>
+            </w:pPr>
+            <w:r>
+              <w:rPr>
+                <w:b/>
+                <w:bCs/>
+              </w:rPr>
+              <w:t>Метрика</w:t>
+            </w:r>
+          </w:p>
+        </w:tc>
+        <w:tc>
+          <w:tcPr>
+            <w:tcW w:w="2336" w:type="dxa"/>
+          </w:tcPr>
+          <w:p>
+            <w:pPr>
+              <w:pStyle w:val="ae"/>
+              <w:rPr>
+                <w:b/>
+                <w:bCs/>
+              </w:rPr>
+            </w:pPr>
+            <w:r>
+              <w:rPr>
+                <w:b/>
+                <w:bCs/>
+              </w:rPr>
+              <w:t>До оптимизации</w:t>
+            </w:r>
+          </w:p>
+        </w:tc>
+        <w:tc>
+          <w:tcPr>
+            <w:tcW w:w="2411" w:type="dxa"/>
+          </w:tcPr>
+          <w:p>
+            <w:pPr>
+              <w:pStyle w:val="ae"/>
+              <w:rPr>
+                <w:b/>
+                <w:bCs/>
+              </w:rPr>
+            </w:pPr>
+            <w:r>
+              <w:rPr>
+                <w:b/>
+                <w:bCs/>
+              </w:rPr>
+              <w:t>После оптимизации</w:t>
+            </w:r>
+          </w:p>
+        </w:tc>
+        <w:tc>
+          <w:tcPr>
+            <w:tcW w:w="2268" w:type="dxa"/>
+          </w:tcPr>
+          <w:p>
+            <w:pPr>
+              <w:pStyle w:val="ae"/>
+              <w:rPr>
+                <w:b/>
+                <w:bCs/>
+              </w:rPr>
+            </w:pPr>
+            <w:r>
+              <w:rPr>
+                <w:b/>
+                <w:bCs/>
+              </w:rPr>
+              <w:t>Вывод</w:t>
+            </w:r>
+          </w:p>
+        </w:tc>
+      </w:tr>
+      <w:tr>
+        <w:tc>
+          <w:tcPr>
+            <w:tcW w:w="2336" w:type="dxa"/>
+          </w:tcPr>
+          <w:p>
+            <w:pPr>
+              <w:pStyle w:val="ae"/>
+            </w:pPr>
+            <w:r>
+              <w:t>План (Оператор)</w:t>
+            </w:r>
+          </w:p>
+        </w:tc>
+        <w:tc>
+          <w:tcPr>
+            <w:tcW w:w="2336" w:type="dxa"/>
+          </w:tcPr>
+          <w:p>
+            <w:pPr>
+              <w:pStyle w:val="ae"/>
+              <w:rPr>
+                <w:lang w:val="en-US"/>
+              </w:rPr>
+            </w:pPr>
+            <w:r>
+              <w:rPr>
+                <w:lang w:val="en-US"/>
+              </w:rPr>
+              <w:t>Seq Scan</w:t>
+            </w:r>
+          </w:p>
+        </w:tc>
+        <w:tc>
+          <w:tcPr>
+            <w:tcW w:w="2411" w:type="dxa"/>
+          </w:tcPr>
+          <w:p>
+            <w:pPr>
+              <w:pStyle w:val="ae"/>
+              <w:rPr>
+                <w:lang w:val="en-US"/>
+              </w:rPr>
+            </w:pPr>
+            <w:r>
+              <w:rPr>
+                <w:lang w:val="en-US"/>
+              </w:rPr>
+              <w:t>Bitmap Heap Scan</w:t>
+            </w:r>
+          </w:p>
+        </w:tc>
+        <w:tc>
+          <w:tcPr>
+            <w:tcW w:w="2268" w:type="dxa"/>
+          </w:tcPr>
+          <w:p>
+            <w:pPr>
+              <w:pStyle w:val="ae"/>
+            </w:pPr>
+            <w:r>
+              <w:t>Выбор отличается</w:t>
+            </w:r>
+          </w:p>
+        </w:tc>
+      </w:tr>
+      <w:tr>
+        <w:tc>
+          <w:tcPr>
+            <w:tcW w:w="2336" w:type="dxa"/>
+          </w:tcPr>
+          <w:p>
+            <w:pPr>
+              <w:pStyle w:val="ae"/>
+              <w:rPr>
+                <w:lang w:val="en-US"/>
+              </w:rPr>
+            </w:pPr>
+            <w:r>
+              <w:rPr>
+                <w:lang w:val="en-US"/>
+              </w:rPr>
+              <w:t>Execution Time</w:t>
+            </w:r>
+          </w:p>
+        </w:tc>
+        <w:tc>
+          <w:tcPr>
+            <w:tcW w:w="2336" w:type="dxa"/>
+          </w:tcPr>
+          <w:p>
+            <w:pPr>
+              <w:pStyle w:val="ae"/>
+              <w:rPr>
+                <w:lang w:val="en-US"/>
+              </w:rPr>
+            </w:pPr>
+            <w:r>
+              <w:t>17.922</w:t>
+            </w:r>
+            <w:r>
+              <w:t xml:space="preserve"> </w:t>
+            </w:r>
+            <w:r>
+              <w:rPr>
+                <w:lang w:val="en-US"/>
+              </w:rPr>
+              <w:t>ms</w:t>
+            </w:r>
+          </w:p>
+        </w:tc>
+        <w:tc>
+          <w:tcPr>
+            <w:tcW w:w="2411" w:type="dxa"/>
+          </w:tcPr>
+          <w:p>
+            <w:pPr>
+              <w:pStyle w:val="ae"/>
+              <w:rPr>
+                <w:lang w:val="en-US"/>
+              </w:rPr>
+            </w:pPr>
+            <w:r>
+              <w:rPr>
+                <w:lang w:val="en-US"/>
+              </w:rPr>
+              <w:t>0.12</w:t>
+            </w:r>
+            <w:r>
+              <w:t>8</w:t>
+            </w:r>
+            <w:r>
+              <w:rPr>
+                <w:lang w:val="en-US"/>
+              </w:rPr>
+              <w:t xml:space="preserve"> ms</w:t>
+            </w:r>
+          </w:p>
+        </w:tc>
+        <w:tc>
+          <w:tcPr>
+            <w:tcW w:w="2268" w:type="dxa"/>
+          </w:tcPr>
+          <w:p>
+            <w:pPr>
+              <w:pStyle w:val="ae"/>
+            </w:pPr>
+            <w:r>
+              <w:t xml:space="preserve">Запрос ускорился примерно в </w:t>
+            </w:r>
+            <w:r>
+              <w:t>140</w:t>
+            </w:r>
+            <w:r>
+              <w:t xml:space="preserve"> раз</w:t>
+            </w:r>
+          </w:p>
+        </w:tc>
+      </w:tr>
+    </w:tbl>
+    <w:p>
+      <w:pPr>
+        <w:pStyle w:val="a4"/>
+      </w:pPr>
+    </w:p>
+    <w:p>
+      <w:pPr>
+        <w:pStyle w:val="4"/>
+        <w:rPr>
+          <w:lang w:val="en-US"/>
+        </w:rPr>
+      </w:pPr>
+      <w:r>
+        <w:lastRenderedPageBreak/>
+        <w:t>Фильтр по цене</w:t>
+      </w:r>
+    </w:p>
+    <w:p>
+      <w:pPr>
+        <w:pStyle w:val="aa"/>
+        <w:keepNext/>
+      </w:pPr>
+      <w:r>
+        <w:rPr>
+          <w:lang w:val="en-US"/>
+        </w:rPr>
+        <w:drawing>
+          <wp:inline distT="0" distB="0" distL="0" distR="0" wp14:anchorId="5131E739" wp14:editId="1C255D8A">
+            <wp:extent cx="5940425" cy="2312670"/>
+            <wp:effectExtent l="0" t="0" r="3175" b="0"/>
+            <wp:docPr id="15" name="Рисунок 15"/>
+            <wp:cNvGraphicFramePr>
+              <a:graphicFrameLocks xmlns:a="http://schemas.openxmlformats.org/drawingml/2006/main" noChangeAspect="1"/>
+            </wp:cNvGraphicFramePr>
+            <a:graphic xmlns:a="http://schemas.openxmlformats.org/drawingml/2006/main">
+              <a:graphicData uri="http://schemas.openxmlformats.org/drawingml/2006/picture">
+                <pic:pic xmlns:pic="http://schemas.openxmlformats.org/drawingml/2006/picture">
+                  <pic:nvPicPr>
+                    <pic:cNvPr id="1" name=""/>
+                    <pic:cNvPicPr/>
+                  </pic:nvPicPr>
+                  <pic:blipFill>
+                    <a:blip r:embed="rId32"/>
+                    <a:stretch>
+                      <a:fillRect/>
+                    </a:stretch>
+                  </pic:blipFill>
+                  <pic:spPr>
+                    <a:xfrm>
+                      <a:off x="0" y="0"/>
+                      <a:ext cx="5940425" cy="2312670"/>
+                    </a:xfrm>
+                    <a:prstGeom prst="rect">
+                      <a:avLst/>
+                    </a:prstGeom>
+                  </pic:spPr>
+                </pic:pic>
+              </a:graphicData>
+            </a:graphic>
+          </wp:inline>
+        </w:drawing>
+      </w:r>
+    </w:p>
+    <w:p>
+      <w:pPr>
+        <w:pStyle w:val="ab"/>
+      </w:pPr>
+      <w:r>
+        <w:t xml:space="preserve">Рисунок </w:t>
+      </w:r>
+      <w:r>
+        <w:fldChar w:fldCharType="begin"/>
+      </w:r>
+      <w:r>
+        <w:instrText xml:space="preserve"> SEQ Рисунок \* ARABIC </w:instrText>
+      </w:r>
+      <w:r>
+        <w:fldChar w:fldCharType="separate"/>
+      </w:r>
+      <w:r>
+        <w:rPr>
+          <w:noProof/>
+        </w:rPr>
+        <w:t>23</w:t>
+      </w:r>
+      <w:r>
+        <w:fldChar w:fldCharType="end"/>
+      </w:r>
+      <w:r>
+        <w:t xml:space="preserve"> – </w:t>
+      </w:r>
+      <w:r>
+        <w:t>Медленный фильтр по цене</w:t>
+      </w:r>
+    </w:p>
+    <w:p>
+      <w:pPr>
+        <w:pStyle w:val="a4"/>
+      </w:pPr>
+      <w:r>
+        <w:rPr>
+          <w:b/>
+          <w:bCs/>
+        </w:rPr>
+        <w:t>Тип</w:t>
+      </w:r>
+      <w:r>
+        <w:rPr>
+          <w:b/>
+          <w:bCs/>
+        </w:rPr>
+        <w:t xml:space="preserve"> </w:t>
+      </w:r>
+      <w:r>
+        <w:rPr>
+          <w:b/>
+          <w:bCs/>
+        </w:rPr>
+        <w:t>плана</w:t>
+      </w:r>
+      <w:r>
+        <w:t xml:space="preserve"> – </w:t>
+      </w:r>
+      <w:r>
+        <w:rPr>
+          <w:lang w:val="en-US"/>
+        </w:rPr>
+        <w:t>Seq</w:t>
+      </w:r>
+      <w:r>
+        <w:t xml:space="preserve"> </w:t>
+      </w:r>
+      <w:r>
+        <w:rPr>
+          <w:lang w:val="en-US"/>
+        </w:rPr>
+        <w:t>Scan</w:t>
+      </w:r>
+      <w:r>
+        <w:t>.</w:t>
+      </w:r>
+    </w:p>
+    <w:p>
+      <w:pPr>
+        <w:pStyle w:val="a4"/>
+        <w:rPr>
+          <w:lang w:val="en-US"/>
+        </w:rPr>
+      </w:pPr>
+      <w:r>
+        <w:rPr>
+          <w:b/>
+          <w:bCs/>
+        </w:rPr>
+        <w:t>Время</w:t>
+      </w:r>
+      <w:r>
+        <w:rPr>
+          <w:b/>
+          <w:bCs/>
+          <w:lang w:val="en-US"/>
+        </w:rPr>
+        <w:t xml:space="preserve"> </w:t>
+      </w:r>
+      <w:r>
+        <w:rPr>
+          <w:b/>
+          <w:bCs/>
+        </w:rPr>
+        <w:t>выполнения</w:t>
+      </w:r>
+      <w:r>
+        <w:rPr>
+          <w:lang w:val="en-US"/>
+        </w:rPr>
+        <w:t xml:space="preserve"> – </w:t>
+      </w:r>
+      <w:r>
+        <w:rPr>
+          <w:lang w:val="en-US"/>
+        </w:rPr>
+        <w:t>Execution</w:t>
+      </w:r>
+      <w:r>
+        <w:rPr>
+          <w:lang w:val="en-US"/>
+        </w:rPr>
+        <w:t xml:space="preserve"> </w:t>
+      </w:r>
+      <w:r>
+        <w:rPr>
+          <w:lang w:val="en-US"/>
+        </w:rPr>
+        <w:t>Time</w:t>
+      </w:r>
+      <w:r>
+        <w:rPr>
+          <w:lang w:val="en-US"/>
+        </w:rPr>
+        <w:t>: 1</w:t>
+      </w:r>
+      <w:r>
+        <w:rPr>
+          <w:lang w:val="en-US"/>
+        </w:rPr>
+        <w:t>0.174</w:t>
+      </w:r>
+      <w:r>
+        <w:rPr>
+          <w:lang w:val="en-US"/>
+        </w:rPr>
+        <w:t xml:space="preserve"> </w:t>
+      </w:r>
+      <w:r>
+        <w:rPr>
+          <w:lang w:val="en-US"/>
+        </w:rPr>
+        <w:t>ms</w:t>
+      </w:r>
+      <w:r>
+        <w:rPr>
+          <w:lang w:val="en-US"/>
+        </w:rPr>
+        <w:t xml:space="preserve">.  </w:t>
+      </w:r>
+    </w:p>
+    <w:p>
+      <w:pPr>
+        <w:pStyle w:val="a4"/>
+      </w:pPr>
+      <w:r>
+        <w:t>Это время будет линейно расти с увеличением таблицы.</w:t>
+      </w:r>
+    </w:p>
+    <w:p>
+      <w:pPr>
+        <w:pStyle w:val="aa"/>
+        <w:keepNext/>
+      </w:pPr>
+      <w:r>
+        <w:rPr>
+          <w:lang w:val="en-US"/>
+        </w:rPr>
+        <w:drawing>
+          <wp:inline distT="0" distB="0" distL="0" distR="0" wp14:anchorId="2389E326" wp14:editId="36E4CCCE">
+            <wp:extent cx="5940425" cy="2161540"/>
+            <wp:effectExtent l="0" t="0" r="3175" b="0"/>
+            <wp:docPr id="16" name="Рисунок 16"/>
+            <wp:cNvGraphicFramePr>
+              <a:graphicFrameLocks xmlns:a="http://schemas.openxmlformats.org/drawingml/2006/main" noChangeAspect="1"/>
+            </wp:cNvGraphicFramePr>
+            <a:graphic xmlns:a="http://schemas.openxmlformats.org/drawingml/2006/main">
+              <a:graphicData uri="http://schemas.openxmlformats.org/drawingml/2006/picture">
+                <pic:pic xmlns:pic="http://schemas.openxmlformats.org/drawingml/2006/picture">
+                  <pic:nvPicPr>
+                    <pic:cNvPr id="1" name=""/>
+                    <pic:cNvPicPr/>
+                  </pic:nvPicPr>
+                  <pic:blipFill>
+                    <a:blip r:embed="rId33"/>
+                    <a:stretch>
+                      <a:fillRect/>
+                    </a:stretch>
+                  </pic:blipFill>
+                  <pic:spPr>
+                    <a:xfrm>
+                      <a:off x="0" y="0"/>
+                      <a:ext cx="5940425" cy="2161540"/>
+                    </a:xfrm>
+                    <a:prstGeom prst="rect">
+                      <a:avLst/>
+                    </a:prstGeom>
+                  </pic:spPr>
+                </pic:pic>
+              </a:graphicData>
+            </a:graphic>
+          </wp:inline>
+        </w:drawing>
+      </w:r>
+    </w:p>
+    <w:p>
+      <w:pPr>
+        <w:pStyle w:val="ab"/>
+      </w:pPr>
+      <w:r>
+        <w:t xml:space="preserve">Рисунок </w:t>
+      </w:r>
+      <w:r>
+        <w:fldChar w:fldCharType="begin"/>
+      </w:r>
+      <w:r>
+        <w:instrText xml:space="preserve"> SEQ Рисунок \* ARABIC </w:instrText>
+      </w:r>
+      <w:r>
+        <w:fldChar w:fldCharType="separate"/>
+      </w:r>
+      <w:r>
+        <w:rPr>
+          <w:noProof/>
+        </w:rPr>
+        <w:t>24</w:t>
+      </w:r>
+      <w:r>
+        <w:fldChar w:fldCharType="end"/>
+      </w:r>
+      <w:r>
+        <w:t xml:space="preserve"> – </w:t>
+      </w:r>
+      <w:r>
+        <w:t>Создание индекса для третьего сценария</w:t>
+      </w:r>
+    </w:p>
+    <w:p>
+      <w:pPr>
+        <w:pStyle w:val="aa"/>
+        <w:keepNext/>
+      </w:pPr>
+      <w:r>
+        <w:lastRenderedPageBreak/>
+        <w:drawing>
+          <wp:inline distT="0" distB="0" distL="0" distR="0" wp14:anchorId="44A4775F" wp14:editId="787E1E85">
+            <wp:extent cx="5940425" cy="2249805"/>
+            <wp:effectExtent l="0" t="0" r="3175" b="0"/>
+            <wp:docPr id="20" name="Рисунок 20"/>
+            <wp:cNvGraphicFramePr>
+              <a:graphicFrameLocks xmlns:a="http://schemas.openxmlformats.org/drawingml/2006/main" noChangeAspect="1"/>
+            </wp:cNvGraphicFramePr>
+            <a:graphic xmlns:a="http://schemas.openxmlformats.org/drawingml/2006/main">
+              <a:graphicData uri="http://schemas.openxmlformats.org/drawingml/2006/picture">
+                <pic:pic xmlns:pic="http://schemas.openxmlformats.org/drawingml/2006/picture">
+                  <pic:nvPicPr>
+                    <pic:cNvPr id="1" name=""/>
+                    <pic:cNvPicPr/>
+                  </pic:nvPicPr>
+                  <pic:blipFill>
+                    <a:blip r:embed="rId34"/>
+                    <a:stretch>
+                      <a:fillRect/>
+                    </a:stretch>
+                  </pic:blipFill>
+                  <pic:spPr>
+                    <a:xfrm>
+                      <a:off x="0" y="0"/>
+                      <a:ext cx="5940425" cy="2249805"/>
+                    </a:xfrm>
+                    <a:prstGeom prst="rect">
+                      <a:avLst/>
+                    </a:prstGeom>
+                  </pic:spPr>
+                </pic:pic>
+              </a:graphicData>
+            </a:graphic>
+          </wp:inline>
+        </w:drawing>
+      </w:r>
+    </w:p>
+    <w:p>
+      <w:pPr>
+        <w:pStyle w:val="ab"/>
+      </w:pPr>
+      <w:r>
+        <w:t xml:space="preserve">Рисунок </w:t>
+      </w:r>
+      <w:r>
+        <w:fldChar w:fldCharType="begin"/>
+      </w:r>
+      <w:r>
+        <w:instrText xml:space="preserve"> SEQ Рисунок \* ARABIC </w:instrText>
+      </w:r>
+      <w:r>
+        <w:fldChar w:fldCharType="separate"/>
+      </w:r>
+      <w:r>
+        <w:rPr>
+          <w:noProof/>
+        </w:rPr>
+        <w:t>25</w:t>
+      </w:r>
+      <w:r>
+        <w:fldChar w:fldCharType="end"/>
+      </w:r>
+      <w:r>
+        <w:t xml:space="preserve"> – Оптимизированный фильтр по цене</w:t>
+      </w:r>
+    </w:p>
+    <w:p>
+      <w:pPr>
+        <w:pStyle w:val="a4"/>
+        <w:rPr>
+          <w:lang w:val="en-US"/>
+        </w:rPr>
+      </w:pPr>
+      <w:r>
+        <w:rPr>
+          <w:b/>
+          <w:bCs/>
+        </w:rPr>
+        <w:t>Тип</w:t>
+      </w:r>
+      <w:r>
+        <w:rPr>
+          <w:b/>
+          <w:bCs/>
+          <w:lang w:val="en-US"/>
+        </w:rPr>
+        <w:t xml:space="preserve"> </w:t>
+      </w:r>
+      <w:r>
+        <w:rPr>
+          <w:b/>
+          <w:bCs/>
+        </w:rPr>
+        <w:t>плана</w:t>
+      </w:r>
+      <w:r>
+        <w:rPr>
+          <w:lang w:val="en-US"/>
+        </w:rPr>
+        <w:t xml:space="preserve"> – </w:t>
+      </w:r>
+      <w:r>
+        <w:rPr>
+          <w:lang w:val="en-US"/>
+        </w:rPr>
+        <w:t>Bitmap Heap</w:t>
+      </w:r>
+      <w:r>
+        <w:rPr>
+          <w:lang w:val="en-US"/>
+        </w:rPr>
+        <w:t xml:space="preserve"> </w:t>
+      </w:r>
+      <w:r>
+        <w:rPr>
+          <w:lang w:val="en-US"/>
+        </w:rPr>
+        <w:t>Scan</w:t>
+      </w:r>
+      <w:r>
+        <w:rPr>
+          <w:lang w:val="en-US"/>
+        </w:rPr>
+        <w:t>.</w:t>
+      </w:r>
+    </w:p>
+    <w:p>
+      <w:pPr>
+        <w:pStyle w:val="a4"/>
+        <w:rPr>
+          <w:lang w:val="en-US"/>
+        </w:rPr>
+      </w:pPr>
+      <w:r>
+        <w:rPr>
+          <w:b/>
+          <w:bCs/>
+        </w:rPr>
+        <w:t>Время</w:t>
+      </w:r>
+      <w:r>
+        <w:rPr>
+          <w:b/>
+          <w:bCs/>
+          <w:lang w:val="en-US"/>
+        </w:rPr>
+        <w:t xml:space="preserve"> </w:t>
+      </w:r>
+      <w:r>
+        <w:rPr>
+          <w:b/>
+          <w:bCs/>
+        </w:rPr>
+        <w:t>выполнения</w:t>
+      </w:r>
+      <w:r>
+        <w:rPr>
+          <w:lang w:val="en-US"/>
+        </w:rPr>
+        <w:t xml:space="preserve"> – </w:t>
+      </w:r>
+      <w:r>
+        <w:rPr>
+          <w:lang w:val="en-US"/>
+        </w:rPr>
+        <w:t>Execution</w:t>
+      </w:r>
+      <w:r>
+        <w:rPr>
+          <w:lang w:val="en-US"/>
+        </w:rPr>
+        <w:t xml:space="preserve"> </w:t>
+      </w:r>
+      <w:r>
+        <w:rPr>
+          <w:lang w:val="en-US"/>
+        </w:rPr>
+        <w:t>Time</w:t>
+      </w:r>
+      <w:r>
+        <w:rPr>
+          <w:lang w:val="en-US"/>
+        </w:rPr>
+        <w:t xml:space="preserve">: </w:t>
+      </w:r>
+      <w:r>
+        <w:rPr>
+          <w:lang w:val="en-US"/>
+        </w:rPr>
+        <w:t>0.</w:t>
+      </w:r>
+      <w:r>
+        <w:rPr>
+          <w:lang w:val="en-US"/>
+        </w:rPr>
+        <w:t>908</w:t>
+      </w:r>
+      <w:r>
+        <w:rPr>
+          <w:lang w:val="en-US"/>
+        </w:rPr>
+        <w:t xml:space="preserve"> </w:t>
+      </w:r>
+      <w:r>
+        <w:rPr>
+          <w:lang w:val="en-US"/>
+        </w:rPr>
+        <w:t>ms</w:t>
+      </w:r>
+      <w:r>
+        <w:rPr>
+          <w:lang w:val="en-US"/>
+        </w:rPr>
+        <w:t xml:space="preserve">.  </w:t>
+      </w:r>
+    </w:p>
+    <w:p>
+      <w:pPr>
+        <w:pStyle w:val="a4"/>
+      </w:pPr>
+      <w:r>
+        <w:t>Это время будет незначительно расти с увеличением таблицы.</w:t>
+      </w:r>
+    </w:p>
+    <w:p>
+      <w:pPr>
+        <w:pStyle w:val="ad"/>
+      </w:pPr>
+      <w:r>
+        <w:t xml:space="preserve">Таблица </w:t>
+      </w:r>
+      <w:r>
+        <w:fldChar w:fldCharType="begin"/>
+      </w:r>
+      <w:r>
+        <w:instrText xml:space="preserve"> SEQ Таблица \* ARABIC </w:instrText>
+      </w:r>
+      <w:r>
+        <w:fldChar w:fldCharType="separate"/>
+      </w:r>
+      <w:r>
+        <w:rPr>
+          <w:noProof/>
+        </w:rPr>
+        <w:t>3</w:t>
+      </w:r>
+      <w:r>
+        <w:fldChar w:fldCharType="end"/>
+      </w:r>
+      <w:r>
+        <w:t xml:space="preserve"> – </w:t>
+      </w:r>
+      <w:r>
+        <w:t>Сравнительная таблица для второго сценария</w:t>
+      </w:r>
+    </w:p>
+    <w:tbl>
+      <w:tblPr>
+        <w:tblStyle w:val="ac"/>
+        <w:tblW w:w="9351" w:type="dxa"/>
+        <w:tblLook w:val="04A0" w:firstRow="1" w:lastRow="0" w:firstColumn="1" w:lastColumn="0" w:noHBand="0" w:noVBand="1"/>
+      </w:tblPr>
+      <w:tblGrid>
+        <w:gridCol w:w="2336"/>
+        <w:gridCol w:w="2336"/>
+        <w:gridCol w:w="2411"/>
+        <w:gridCol w:w="2268"/>
+      </w:tblGrid>
+      <w:tr>
+        <w:tc>
+          <w:tcPr>
+            <w:tcW w:w="2336" w:type="dxa"/>
+          </w:tcPr>
+          <w:p>
+            <w:pPr>
+              <w:pStyle w:val="ae"/>
+              <w:rPr>
+                <w:b/>
+                <w:bCs/>
+              </w:rPr>
+            </w:pPr>
+            <w:r>
+              <w:rPr>
+                <w:b/>
+                <w:bCs/>
+              </w:rPr>
+              <w:t>Метрика</w:t>
+            </w:r>
+          </w:p>
+        </w:tc>
+        <w:tc>
+          <w:tcPr>
+            <w:tcW w:w="2336" w:type="dxa"/>
+          </w:tcPr>
+          <w:p>
+            <w:pPr>
+              <w:pStyle w:val="ae"/>
+              <w:rPr>
+                <w:b/>
+                <w:bCs/>
+              </w:rPr>
+            </w:pPr>
+            <w:r>
+              <w:rPr>
+                <w:b/>
+                <w:bCs/>
+              </w:rPr>
+              <w:t>До оптимизации</w:t>
+            </w:r>
+          </w:p>
+        </w:tc>
+        <w:tc>
+          <w:tcPr>
+            <w:tcW w:w="2411" w:type="dxa"/>
+          </w:tcPr>
+          <w:p>
+            <w:pPr>
+              <w:pStyle w:val="ae"/>
+              <w:rPr>
+                <w:b/>
+                <w:bCs/>
+              </w:rPr>
+            </w:pPr>
+            <w:r>
+              <w:rPr>
+                <w:b/>
+                <w:bCs/>
+              </w:rPr>
+              <w:t>После оптимизации</w:t>
+            </w:r>
+          </w:p>
+        </w:tc>
+        <w:tc>
+          <w:tcPr>
+            <w:tcW w:w="2268" w:type="dxa"/>
+          </w:tcPr>
+          <w:p>
+            <w:pPr>
+              <w:pStyle w:val="ae"/>
+              <w:rPr>
+                <w:b/>
+                <w:bCs/>
+              </w:rPr>
+            </w:pPr>
+            <w:r>
+              <w:rPr>
+                <w:b/>
+                <w:bCs/>
+              </w:rPr>
+              <w:t>Вывод</w:t>
+            </w:r>
+          </w:p>
+        </w:tc>
+      </w:tr>
+      <w:tr>
+        <w:tc>
+          <w:tcPr>
+            <w:tcW w:w="2336" w:type="dxa"/>
+          </w:tcPr>
+          <w:p>
+            <w:pPr>
+              <w:pStyle w:val="ae"/>
+            </w:pPr>
+            <w:r>
+              <w:t>План (Оператор)</w:t>
+            </w:r>
+          </w:p>
+        </w:tc>
+        <w:tc>
+          <w:tcPr>
+            <w:tcW w:w="2336" w:type="dxa"/>
+          </w:tcPr>
+          <w:p>
+            <w:pPr>
+              <w:pStyle w:val="ae"/>
+              <w:rPr>
+                <w:lang w:val="en-US"/>
+              </w:rPr>
+            </w:pPr>
+            <w:r>
+              <w:rPr>
+                <w:lang w:val="en-US"/>
+              </w:rPr>
+              <w:t>Seq Scan</w:t>
+            </w:r>
+          </w:p>
+        </w:tc>
+        <w:tc>
+          <w:tcPr>
+            <w:tcW w:w="2411" w:type="dxa"/>
+          </w:tcPr>
+          <w:p>
+            <w:pPr>
+              <w:pStyle w:val="ae"/>
+              <w:rPr>
+                <w:lang w:val="en-US"/>
+              </w:rPr>
+            </w:pPr>
+            <w:r>
+              <w:rPr>
+                <w:lang w:val="en-US"/>
+              </w:rPr>
+              <w:t>Bitmap Heap Scan</w:t>
+            </w:r>
+          </w:p>
+        </w:tc>
+        <w:tc>
+          <w:tcPr>
+            <w:tcW w:w="2268" w:type="dxa"/>
+          </w:tcPr>
+          <w:p>
+            <w:pPr>
+              <w:pStyle w:val="ae"/>
+            </w:pPr>
+            <w:r>
+              <w:t>Выбор отличается</w:t>
+            </w:r>
+          </w:p>
+        </w:tc>
+      </w:tr>
+      <w:tr>
+        <w:tc>
+          <w:tcPr>
+            <w:tcW w:w="2336" w:type="dxa"/>
+          </w:tcPr>
+          <w:p>
+            <w:pPr>
+              <w:pStyle w:val="ae"/>
+              <w:rPr>
+                <w:lang w:val="en-US"/>
+              </w:rPr>
+            </w:pPr>
+            <w:r>
+              <w:rPr>
+                <w:lang w:val="en-US"/>
+              </w:rPr>
+              <w:t>Execution Time</w:t>
+            </w:r>
+          </w:p>
+        </w:tc>
+        <w:tc>
+          <w:tcPr>
+            <w:tcW w:w="2336" w:type="dxa"/>
+          </w:tcPr>
+          <w:p>
+            <w:pPr>
+              <w:pStyle w:val="ae"/>
+              <w:rPr>
+                <w:lang w:val="en-US"/>
+              </w:rPr>
+            </w:pPr>
+            <w:r>
+              <w:rPr>
+                <w:lang w:val="en-US"/>
+              </w:rPr>
+              <w:t>10.174</w:t>
+            </w:r>
+            <w:r>
+              <w:t xml:space="preserve"> </w:t>
+            </w:r>
+            <w:r>
+              <w:rPr>
+                <w:lang w:val="en-US"/>
+              </w:rPr>
+              <w:t>ms</w:t>
+            </w:r>
+          </w:p>
+        </w:tc>
+        <w:tc>
+          <w:tcPr>
+            <w:tcW w:w="2411" w:type="dxa"/>
+          </w:tcPr>
+          <w:p>
+            <w:pPr>
+              <w:pStyle w:val="ae"/>
+              <w:rPr>
+                <w:lang w:val="en-US"/>
+              </w:rPr>
+            </w:pPr>
+            <w:r>
+              <w:rPr>
+                <w:lang w:val="en-US"/>
+              </w:rPr>
+              <w:t>0.</w:t>
+            </w:r>
+            <w:r>
+              <w:rPr>
+                <w:lang w:val="en-US"/>
+              </w:rPr>
+              <w:t>908</w:t>
+            </w:r>
+            <w:r>
+              <w:rPr>
+                <w:lang w:val="en-US"/>
+              </w:rPr>
+              <w:t xml:space="preserve"> ms</w:t>
+            </w:r>
+          </w:p>
+        </w:tc>
+        <w:tc>
+          <w:tcPr>
+            <w:tcW w:w="2268" w:type="dxa"/>
+          </w:tcPr>
+          <w:p>
+            <w:pPr>
+              <w:pStyle w:val="ae"/>
+            </w:pPr>
+            <w:r>
+              <w:t xml:space="preserve">Запрос ускорился примерно в </w:t>
+            </w:r>
+            <w:r>
+              <w:t>11</w:t>
+            </w:r>
+            <w:r>
+              <w:t xml:space="preserve"> раз</w:t>
+            </w:r>
+          </w:p>
+        </w:tc>
+      </w:tr>
+    </w:tbl>
+    <w:p>
+      <w:pPr>
+        <w:pStyle w:val="a4"/>
+      </w:pPr>
     </w:p>
     <w:p>
       <w:pPr>
         <w:pStyle w:val="3"/>
-      </w:pPr>
-      <w:proofErr w:type="spellStart"/>
-      <w:r>
-        <w:t>аав</w:t>
-      </w:r>
-      <w:proofErr w:type="spellEnd"/>
+        <w:rPr>
+          <w:lang w:val="en-US"/>
+        </w:rPr>
+      </w:pPr>
+      <w:r>
+        <w:t>Д</w:t>
+      </w:r>
+      <w:r>
+        <w:t>емонстрация атомарной транзакции (COMMIT)</w:t>
+      </w:r>
+    </w:p>
+    <w:p>
+      <w:pPr>
+        <w:pStyle w:val="aa"/>
+        <w:keepNext/>
+      </w:pPr>
+      <w:r>
+        <w:drawing>
+          <wp:inline distT="0" distB="0" distL="0" distR="0" wp14:anchorId="65CAB644" wp14:editId="09A1A5B6">
+            <wp:extent cx="5940425" cy="3149600"/>
+            <wp:effectExtent l="0" t="0" r="3175" b="0"/>
+            <wp:docPr id="21" name="Рисунок 21"/>
+            <wp:cNvGraphicFramePr>
+              <a:graphicFrameLocks xmlns:a="http://schemas.openxmlformats.org/drawingml/2006/main" noChangeAspect="1"/>
+            </wp:cNvGraphicFramePr>
+            <a:graphic xmlns:a="http://schemas.openxmlformats.org/drawingml/2006/main">
+              <a:graphicData uri="http://schemas.openxmlformats.org/drawingml/2006/picture">
+                <pic:pic xmlns:pic="http://schemas.openxmlformats.org/drawingml/2006/picture">
+                  <pic:nvPicPr>
+                    <pic:cNvPr id="1" name=""/>
+                    <pic:cNvPicPr/>
+                  </pic:nvPicPr>
+                  <pic:blipFill>
+                    <a:blip r:embed="rId35"/>
+                    <a:stretch>
+                      <a:fillRect/>
+                    </a:stretch>
+                  </pic:blipFill>
+                  <pic:spPr>
+                    <a:xfrm>
+                      <a:off x="0" y="0"/>
+                      <a:ext cx="5940425" cy="3149600"/>
+                    </a:xfrm>
+                    <a:prstGeom prst="rect">
+                      <a:avLst/>
+                    </a:prstGeom>
+                  </pic:spPr>
+                </pic:pic>
+              </a:graphicData>
+            </a:graphic>
+          </wp:inline>
+        </w:drawing>
+      </w:r>
+    </w:p>
+    <w:p>
+      <w:pPr>
+        <w:pStyle w:val="ab"/>
+      </w:pPr>
+      <w:r>
+        <w:t xml:space="preserve">Рисунок </w:t>
+      </w:r>
+      <w:r>
+        <w:fldChar w:fldCharType="begin"/>
+      </w:r>
+      <w:r>
+        <w:instrText xml:space="preserve"> SEQ Рисунок \* ARABIC </w:instrText>
+      </w:r>
+      <w:r>
+        <w:fldChar w:fldCharType="separate"/>
+      </w:r>
+      <w:r>
+        <w:rPr>
+          <w:noProof/>
+        </w:rPr>
+        <w:t>26</w:t>
+      </w:r>
+      <w:r>
+        <w:fldChar w:fldCharType="end"/>
+      </w:r>
+      <w:r>
+        <w:t xml:space="preserve"> – </w:t>
+      </w:r>
+      <w:r>
+        <w:t>Проверка исходных данных, часть 1</w:t>
+      </w:r>
+    </w:p>
+    <w:p>
+      <w:pPr>
+        <w:pStyle w:val="aa"/>
+        <w:keepNext/>
+      </w:pPr>
+      <w:r>
+        <w:lastRenderedPageBreak/>
+        <w:drawing>
+          <wp:inline distT="0" distB="0" distL="0" distR="0" wp14:anchorId="3236FA2E" wp14:editId="083B732C">
+            <wp:extent cx="5940425" cy="1849087"/>
+            <wp:effectExtent l="0" t="0" r="3175" b="0"/>
+            <wp:docPr id="22" name="Рисунок 22"/>
+            <wp:cNvGraphicFramePr>
+              <a:graphicFrameLocks xmlns:a="http://schemas.openxmlformats.org/drawingml/2006/main" noChangeAspect="1"/>
+            </wp:cNvGraphicFramePr>
+            <a:graphic xmlns:a="http://schemas.openxmlformats.org/drawingml/2006/main">
+              <a:graphicData uri="http://schemas.openxmlformats.org/drawingml/2006/picture">
+                <pic:pic xmlns:pic="http://schemas.openxmlformats.org/drawingml/2006/picture">
+                  <pic:nvPicPr>
+                    <pic:cNvPr id="22" name="Рисунок 22"/>
+                    <pic:cNvPicPr/>
+                  </pic:nvPicPr>
+                  <pic:blipFill>
+                    <a:blip r:embed="rId36">
+                      <a:extLst>
+                        <a:ext uri="{28A0092B-C50C-407E-A947-70E740481C1C}">
+                          <a14:useLocalDpi xmlns:a14="http://schemas.microsoft.com/office/drawing/2010/main" val="0"/>
+                        </a:ext>
+                      </a:extLst>
+                    </a:blip>
+                    <a:stretch>
+                      <a:fillRect/>
+                    </a:stretch>
+                  </pic:blipFill>
+                  <pic:spPr>
+                    <a:xfrm>
+                      <a:off x="0" y="0"/>
+                      <a:ext cx="5940425" cy="1849087"/>
+                    </a:xfrm>
+                    <a:prstGeom prst="rect">
+                      <a:avLst/>
+                    </a:prstGeom>
+                  </pic:spPr>
+                </pic:pic>
+              </a:graphicData>
+            </a:graphic>
+          </wp:inline>
+        </w:drawing>
+      </w:r>
+    </w:p>
+    <w:p>
+      <w:pPr>
+        <w:pStyle w:val="ab"/>
+      </w:pPr>
+      <w:r>
+        <w:t xml:space="preserve">Рисунок </w:t>
+      </w:r>
+      <w:r>
+        <w:fldChar w:fldCharType="begin"/>
+      </w:r>
+      <w:r>
+        <w:instrText xml:space="preserve"> SEQ Рисунок \* ARABIC </w:instrText>
+      </w:r>
+      <w:r>
+        <w:fldChar w:fldCharType="separate"/>
+      </w:r>
+      <w:r>
+        <w:rPr>
+          <w:noProof/>
+        </w:rPr>
+        <w:t>27</w:t>
+      </w:r>
+      <w:r>
+        <w:fldChar w:fldCharType="end"/>
+      </w:r>
+      <w:r>
+        <w:t xml:space="preserve"> – Проверка исходных данных, часть 2</w:t>
+      </w:r>
+    </w:p>
+    <w:p>
+      <w:pPr>
+        <w:pStyle w:val="aa"/>
+        <w:keepNext/>
+      </w:pPr>
+      <w:r>
+        <w:rPr>
+          <w:lang w:val="en-US"/>
+        </w:rPr>
+        <w:drawing>
+          <wp:inline distT="0" distB="0" distL="0" distR="0" wp14:anchorId="6B4914DF" wp14:editId="5612DCB9">
+            <wp:extent cx="5940425" cy="4358005"/>
+            <wp:effectExtent l="0" t="0" r="3175" b="4445"/>
+            <wp:docPr id="25" name="Рисунок 25"/>
+            <wp:cNvGraphicFramePr>
+              <a:graphicFrameLocks xmlns:a="http://schemas.openxmlformats.org/drawingml/2006/main" noChangeAspect="1"/>
+            </wp:cNvGraphicFramePr>
+            <a:graphic xmlns:a="http://schemas.openxmlformats.org/drawingml/2006/main">
+              <a:graphicData uri="http://schemas.openxmlformats.org/drawingml/2006/picture">
+                <pic:pic xmlns:pic="http://schemas.openxmlformats.org/drawingml/2006/picture">
+                  <pic:nvPicPr>
+                    <pic:cNvPr id="1" name=""/>
+                    <pic:cNvPicPr/>
+                  </pic:nvPicPr>
+                  <pic:blipFill>
+                    <a:blip r:embed="rId37"/>
+                    <a:stretch>
+                      <a:fillRect/>
+                    </a:stretch>
+                  </pic:blipFill>
+                  <pic:spPr>
+                    <a:xfrm>
+                      <a:off x="0" y="0"/>
+                      <a:ext cx="5940425" cy="4358005"/>
+                    </a:xfrm>
+                    <a:prstGeom prst="rect">
+                      <a:avLst/>
+                    </a:prstGeom>
+                  </pic:spPr>
+                </pic:pic>
+              </a:graphicData>
+            </a:graphic>
+          </wp:inline>
+        </w:drawing>
+      </w:r>
+    </w:p>
+    <w:p>
+      <w:pPr>
+        <w:pStyle w:val="ab"/>
+      </w:pPr>
+      <w:r>
+        <w:t xml:space="preserve">Рисунок </w:t>
+      </w:r>
+      <w:r>
+        <w:fldChar w:fldCharType="begin"/>
+      </w:r>
+      <w:r>
+        <w:instrText xml:space="preserve"> SEQ Рисунок \* ARABIC </w:instrText>
+      </w:r>
+      <w:r>
+        <w:fldChar w:fldCharType="separate"/>
+      </w:r>
+      <w:r>
+        <w:rPr>
+          <w:noProof/>
+        </w:rPr>
+        <w:t>28</w:t>
+      </w:r>
+      <w:r>
+        <w:fldChar w:fldCharType="end"/>
+      </w:r>
+      <w:r>
+        <w:t xml:space="preserve"> – </w:t>
+      </w:r>
+      <w:r>
+        <w:t>Транзакция добавления в существующий заказ блюда</w:t>
+      </w:r>
+    </w:p>
+    <w:p>
+      <w:pPr>
+        <w:pStyle w:val="aa"/>
+        <w:keepNext/>
+      </w:pPr>
+      <w:r>
+        <w:drawing>
+          <wp:inline distT="0" distB="0" distL="0" distR="0" wp14:anchorId="3F3A3823" wp14:editId="02B997DF">
+            <wp:extent cx="5940425" cy="1390015"/>
+            <wp:effectExtent l="0" t="0" r="3175" b="635"/>
+            <wp:docPr id="31" name="Рисунок 31"/>
+            <wp:cNvGraphicFramePr>
+              <a:graphicFrameLocks xmlns:a="http://schemas.openxmlformats.org/drawingml/2006/main" noChangeAspect="1"/>
+            </wp:cNvGraphicFramePr>
+            <a:graphic xmlns:a="http://schemas.openxmlformats.org/drawingml/2006/main">
+              <a:graphicData uri="http://schemas.openxmlformats.org/drawingml/2006/picture">
+                <pic:pic xmlns:pic="http://schemas.openxmlformats.org/drawingml/2006/picture">
+                  <pic:nvPicPr>
+                    <pic:cNvPr id="1" name=""/>
+                    <pic:cNvPicPr/>
+                  </pic:nvPicPr>
+                  <pic:blipFill>
+                    <a:blip r:embed="rId38"/>
+                    <a:stretch>
+                      <a:fillRect/>
+                    </a:stretch>
+                  </pic:blipFill>
+                  <pic:spPr>
+                    <a:xfrm>
+                      <a:off x="0" y="0"/>
+                      <a:ext cx="5940425" cy="1390015"/>
+                    </a:xfrm>
+                    <a:prstGeom prst="rect">
+                      <a:avLst/>
+                    </a:prstGeom>
+                  </pic:spPr>
+                </pic:pic>
+              </a:graphicData>
+            </a:graphic>
+          </wp:inline>
+        </w:drawing>
+      </w:r>
+    </w:p>
+    <w:p>
+      <w:pPr>
+        <w:pStyle w:val="ab"/>
+      </w:pPr>
+      <w:r>
+        <w:t xml:space="preserve">Рисунок </w:t>
+      </w:r>
+      <w:r>
+        <w:fldChar w:fldCharType="begin"/>
+      </w:r>
+      <w:r>
+        <w:instrText xml:space="preserve"> SEQ Рисунок \* ARABIC </w:instrText>
+      </w:r>
+      <w:r>
+        <w:fldChar w:fldCharType="separate"/>
+      </w:r>
+      <w:r>
+        <w:rPr>
+          <w:noProof/>
+        </w:rPr>
+        <w:t>29</w:t>
+      </w:r>
+      <w:r>
+        <w:fldChar w:fldCharType="end"/>
+      </w:r>
+      <w:r>
+        <w:t xml:space="preserve"> – Проверка данных после выполнения транзакции, часть 1</w:t>
+      </w:r>
+    </w:p>
+    <w:p>
+      <w:pPr>
+        <w:pStyle w:val="aa"/>
+        <w:keepNext/>
+      </w:pPr>
+      <w:r>
+        <w:lastRenderedPageBreak/>
+        <w:drawing>
+          <wp:inline distT="0" distB="0" distL="0" distR="0" wp14:anchorId="2784C762" wp14:editId="1F6A9CC2">
+            <wp:extent cx="5940425" cy="751205"/>
+            <wp:effectExtent l="0" t="0" r="3175" b="0"/>
+            <wp:docPr id="32" name="Рисунок 32"/>
+            <wp:cNvGraphicFramePr>
+              <a:graphicFrameLocks xmlns:a="http://schemas.openxmlformats.org/drawingml/2006/main" noChangeAspect="1"/>
+            </wp:cNvGraphicFramePr>
+            <a:graphic xmlns:a="http://schemas.openxmlformats.org/drawingml/2006/main">
+              <a:graphicData uri="http://schemas.openxmlformats.org/drawingml/2006/picture">
+                <pic:pic xmlns:pic="http://schemas.openxmlformats.org/drawingml/2006/picture">
+                  <pic:nvPicPr>
+                    <pic:cNvPr id="1" name=""/>
+                    <pic:cNvPicPr/>
+                  </pic:nvPicPr>
+                  <pic:blipFill>
+                    <a:blip r:embed="rId39"/>
+                    <a:stretch>
+                      <a:fillRect/>
+                    </a:stretch>
+                  </pic:blipFill>
+                  <pic:spPr>
+                    <a:xfrm>
+                      <a:off x="0" y="0"/>
+                      <a:ext cx="5940425" cy="751205"/>
+                    </a:xfrm>
+                    <a:prstGeom prst="rect">
+                      <a:avLst/>
+                    </a:prstGeom>
+                  </pic:spPr>
+                </pic:pic>
+              </a:graphicData>
+            </a:graphic>
+          </wp:inline>
+        </w:drawing>
+      </w:r>
+    </w:p>
+    <w:p>
+      <w:pPr>
+        <w:pStyle w:val="ab"/>
+      </w:pPr>
+      <w:r>
+        <w:t xml:space="preserve">Рисунок </w:t>
+      </w:r>
+      <w:r>
+        <w:fldChar w:fldCharType="begin"/>
+      </w:r>
+      <w:r>
+        <w:instrText xml:space="preserve"> SEQ Рисунок \* ARABIC </w:instrText>
+      </w:r>
+      <w:r>
+        <w:fldChar w:fldCharType="separate"/>
+      </w:r>
+      <w:r>
+        <w:rPr>
+          <w:noProof/>
+        </w:rPr>
+        <w:t>30</w:t>
+      </w:r>
+      <w:r>
+        <w:fldChar w:fldCharType="end"/>
+      </w:r>
+      <w:r>
+        <w:t xml:space="preserve"> – Проверка данных после выполнения транзакции, часть 2</w:t>
+      </w:r>
+    </w:p>
+    <w:p>
+      <w:pPr>
+        <w:pStyle w:val="3"/>
+        <w:rPr>
+          <w:bCs/>
+        </w:rPr>
+      </w:pPr>
+      <w:r>
+        <w:rPr>
+          <w:bCs/>
+        </w:rPr>
+        <w:t>Демонстрация отката транзакции (ROLLBACK)</w:t>
+      </w:r>
+    </w:p>
+    <w:p>
+      <w:pPr>
+        <w:pStyle w:val="aa"/>
+        <w:keepNext/>
+      </w:pPr>
+      <w:r>
+        <w:rPr>
+          <w:lang w:val="en-US"/>
+        </w:rPr>
+        <w:drawing>
+          <wp:inline distT="0" distB="0" distL="0" distR="0" wp14:anchorId="364F0076" wp14:editId="488FC3DB">
+            <wp:extent cx="5940425" cy="4459605"/>
+            <wp:effectExtent l="0" t="0" r="3175" b="0"/>
+            <wp:docPr id="33" name="Рисунок 33"/>
+            <wp:cNvGraphicFramePr>
+              <a:graphicFrameLocks xmlns:a="http://schemas.openxmlformats.org/drawingml/2006/main" noChangeAspect="1"/>
+            </wp:cNvGraphicFramePr>
+            <a:graphic xmlns:a="http://schemas.openxmlformats.org/drawingml/2006/main">
+              <a:graphicData uri="http://schemas.openxmlformats.org/drawingml/2006/picture">
+                <pic:pic xmlns:pic="http://schemas.openxmlformats.org/drawingml/2006/picture">
+                  <pic:nvPicPr>
+                    <pic:cNvPr id="1" name=""/>
+                    <pic:cNvPicPr/>
+                  </pic:nvPicPr>
+                  <pic:blipFill>
+                    <a:blip r:embed="rId40"/>
+                    <a:stretch>
+                      <a:fillRect/>
+                    </a:stretch>
+                  </pic:blipFill>
+                  <pic:spPr>
+                    <a:xfrm>
+                      <a:off x="0" y="0"/>
+                      <a:ext cx="5940425" cy="4459605"/>
+                    </a:xfrm>
+                    <a:prstGeom prst="rect">
+                      <a:avLst/>
+                    </a:prstGeom>
+                  </pic:spPr>
+                </pic:pic>
+              </a:graphicData>
+            </a:graphic>
+          </wp:inline>
+        </w:drawing>
+      </w:r>
+    </w:p>
+    <w:p>
+      <w:pPr>
+        <w:pStyle w:val="ab"/>
+      </w:pPr>
+      <w:r>
+        <w:t xml:space="preserve">Рисунок </w:t>
+      </w:r>
+      <w:r>
+        <w:fldChar w:fldCharType="begin"/>
+      </w:r>
+      <w:r>
+        <w:instrText xml:space="preserve"> SEQ Рисунок \* ARABIC </w:instrText>
+      </w:r>
+      <w:r>
+        <w:fldChar w:fldCharType="separate"/>
+      </w:r>
+      <w:r>
+        <w:rPr>
+          <w:noProof/>
+        </w:rPr>
+        <w:t>31</w:t>
+      </w:r>
+      <w:r>
+        <w:fldChar w:fldCharType="end"/>
+      </w:r>
+      <w:r>
+        <w:t xml:space="preserve"> – </w:t>
+      </w:r>
+      <w:r>
+        <w:t>Вызов ошибки при выполнении транзакции</w:t>
+      </w:r>
+    </w:p>
+    <w:p>
+      <w:pPr>
+        <w:pStyle w:val="aa"/>
+        <w:keepNext/>
+      </w:pPr>
+      <w:r>
+        <w:rPr>
+          <w:lang w:val="en-US"/>
+        </w:rPr>
+        <w:lastRenderedPageBreak/>
+        <w:drawing>
+          <wp:inline distT="0" distB="0" distL="0" distR="0" wp14:anchorId="53935658" wp14:editId="4D9EF2F9">
+            <wp:extent cx="5940425" cy="3467100"/>
+            <wp:effectExtent l="0" t="0" r="3175" b="0"/>
+            <wp:docPr id="36" name="Рисунок 36"/>
+            <wp:cNvGraphicFramePr>
+              <a:graphicFrameLocks xmlns:a="http://schemas.openxmlformats.org/drawingml/2006/main" noChangeAspect="1"/>
+            </wp:cNvGraphicFramePr>
+            <a:graphic xmlns:a="http://schemas.openxmlformats.org/drawingml/2006/main">
+              <a:graphicData uri="http://schemas.openxmlformats.org/drawingml/2006/picture">
+                <pic:pic xmlns:pic="http://schemas.openxmlformats.org/drawingml/2006/picture">
+                  <pic:nvPicPr>
+                    <pic:cNvPr id="1" name=""/>
+                    <pic:cNvPicPr/>
+                  </pic:nvPicPr>
+                  <pic:blipFill>
+                    <a:blip r:embed="rId41"/>
+                    <a:stretch>
+                      <a:fillRect/>
+                    </a:stretch>
+                  </pic:blipFill>
+                  <pic:spPr>
+                    <a:xfrm>
+                      <a:off x="0" y="0"/>
+                      <a:ext cx="5940425" cy="3467100"/>
+                    </a:xfrm>
+                    <a:prstGeom prst="rect">
+                      <a:avLst/>
+                    </a:prstGeom>
+                  </pic:spPr>
+                </pic:pic>
+              </a:graphicData>
+            </a:graphic>
+          </wp:inline>
+        </w:drawing>
+      </w:r>
+    </w:p>
+    <w:p>
+      <w:pPr>
+        <w:pStyle w:val="ab"/>
+      </w:pPr>
+      <w:r>
+        <w:t xml:space="preserve">Рисунок </w:t>
+      </w:r>
+      <w:r>
+        <w:fldChar w:fldCharType="begin"/>
+      </w:r>
+      <w:r>
+        <w:instrText xml:space="preserve"> SEQ Рисунок \* ARABIC </w:instrText>
+      </w:r>
+      <w:r>
+        <w:fldChar w:fldCharType="separate"/>
+      </w:r>
+      <w:r>
+        <w:rPr>
+          <w:noProof/>
+        </w:rPr>
+        <w:t>32</w:t>
+      </w:r>
+      <w:r>
+        <w:fldChar w:fldCharType="end"/>
+      </w:r>
+      <w:r>
+        <w:t xml:space="preserve"> – </w:t>
+      </w:r>
+      <w:r>
+        <w:t>Ошибка при выполнении запроса в ошибочной транзакции</w:t>
+      </w:r>
+    </w:p>
+    <w:p>
+      <w:pPr>
+        <w:pStyle w:val="a4"/>
+        <w:rPr>
+          <w:lang w:val="en-US"/>
+        </w:rPr>
+      </w:pPr>
+      <w:r>
+        <w:t xml:space="preserve">Выполним команду </w:t>
+      </w:r>
+      <w:r>
+        <w:rPr>
+          <w:lang w:val="en-US"/>
+        </w:rPr>
+        <w:t>ROLLBACK.</w:t>
+      </w:r>
+    </w:p>
+    <w:p>
+      <w:pPr>
+        <w:pStyle w:val="aa"/>
+        <w:keepNext/>
+      </w:pPr>
+      <w:r>
+        <w:drawing>
+          <wp:inline distT="0" distB="0" distL="0" distR="0" wp14:anchorId="00BDE7CC" wp14:editId="10723DB3">
+            <wp:extent cx="5940425" cy="1390015"/>
+            <wp:effectExtent l="0" t="0" r="3175" b="635"/>
+            <wp:docPr id="34" name="Рисунок 34"/>
+            <wp:cNvGraphicFramePr>
+              <a:graphicFrameLocks xmlns:a="http://schemas.openxmlformats.org/drawingml/2006/main" noChangeAspect="1"/>
+            </wp:cNvGraphicFramePr>
+            <a:graphic xmlns:a="http://schemas.openxmlformats.org/drawingml/2006/main">
+              <a:graphicData uri="http://schemas.openxmlformats.org/drawingml/2006/picture">
+                <pic:pic xmlns:pic="http://schemas.openxmlformats.org/drawingml/2006/picture">
+                  <pic:nvPicPr>
+                    <pic:cNvPr id="1" name=""/>
+                    <pic:cNvPicPr/>
+                  </pic:nvPicPr>
+                  <pic:blipFill>
+                    <a:blip r:embed="rId38"/>
+                    <a:stretch>
+                      <a:fillRect/>
+                    </a:stretch>
+                  </pic:blipFill>
+                  <pic:spPr>
+                    <a:xfrm>
+                      <a:off x="0" y="0"/>
+                      <a:ext cx="5940425" cy="1390015"/>
+                    </a:xfrm>
+                    <a:prstGeom prst="rect">
+                      <a:avLst/>
+                    </a:prstGeom>
+                  </pic:spPr>
+                </pic:pic>
+              </a:graphicData>
+            </a:graphic>
+          </wp:inline>
+        </w:drawing>
+      </w:r>
+    </w:p>
+    <w:p>
+      <w:pPr>
+        <w:pStyle w:val="ab"/>
+      </w:pPr>
+      <w:r>
+        <w:t xml:space="preserve">Рисунок </w:t>
+      </w:r>
+      <w:r>
+        <w:fldChar w:fldCharType="begin"/>
+      </w:r>
+      <w:r>
+        <w:instrText xml:space="preserve"> SEQ Рисунок \* ARABIC </w:instrText>
+      </w:r>
+      <w:r>
+        <w:fldChar w:fldCharType="separate"/>
+      </w:r>
+      <w:r>
+        <w:rPr>
+          <w:noProof/>
+        </w:rPr>
+        <w:t>33</w:t>
+      </w:r>
+      <w:r>
+        <w:fldChar w:fldCharType="end"/>
+      </w:r>
+      <w:r>
+        <w:t xml:space="preserve"> – Проверка данных после</w:t>
+      </w:r>
+      <w:r>
+        <w:t xml:space="preserve"> </w:t>
+      </w:r>
+      <w:r>
+        <w:rPr>
+          <w:lang w:val="en-US"/>
+        </w:rPr>
+        <w:t>ROLLBACK</w:t>
+      </w:r>
+      <w:r>
+        <w:t>, часть 1</w:t>
+      </w:r>
+    </w:p>
+    <w:p>
+      <w:pPr>
+        <w:pStyle w:val="aa"/>
+        <w:keepNext/>
+      </w:pPr>
+      <w:r>
+        <w:drawing>
+          <wp:inline distT="0" distB="0" distL="0" distR="0" wp14:anchorId="09B5C589" wp14:editId="1D67DF04">
+            <wp:extent cx="5940425" cy="751205"/>
+            <wp:effectExtent l="0" t="0" r="3175" b="0"/>
+            <wp:docPr id="35" name="Рисунок 35"/>
+            <wp:cNvGraphicFramePr>
+              <a:graphicFrameLocks xmlns:a="http://schemas.openxmlformats.org/drawingml/2006/main" noChangeAspect="1"/>
+            </wp:cNvGraphicFramePr>
+            <a:graphic xmlns:a="http://schemas.openxmlformats.org/drawingml/2006/main">
+              <a:graphicData uri="http://schemas.openxmlformats.org/drawingml/2006/picture">
+                <pic:pic xmlns:pic="http://schemas.openxmlformats.org/drawingml/2006/picture">
+                  <pic:nvPicPr>
+                    <pic:cNvPr id="1" name=""/>
+                    <pic:cNvPicPr/>
+                  </pic:nvPicPr>
+                  <pic:blipFill>
+                    <a:blip r:embed="rId39"/>
+                    <a:stretch>
+                      <a:fillRect/>
+                    </a:stretch>
+                  </pic:blipFill>
+                  <pic:spPr>
+                    <a:xfrm>
+                      <a:off x="0" y="0"/>
+                      <a:ext cx="5940425" cy="751205"/>
+                    </a:xfrm>
+                    <a:prstGeom prst="rect">
+                      <a:avLst/>
+                    </a:prstGeom>
+                  </pic:spPr>
+                </pic:pic>
+              </a:graphicData>
+            </a:graphic>
+          </wp:inline>
+        </w:drawing>
+      </w:r>
+    </w:p>
+    <w:p>
+      <w:pPr>
+        <w:pStyle w:val="ab"/>
+      </w:pPr>
+      <w:r>
+        <w:t xml:space="preserve">Рисунок </w:t>
+      </w:r>
+      <w:r>
+        <w:fldChar w:fldCharType="begin"/>
+      </w:r>
+      <w:r>
+        <w:instrText xml:space="preserve"> SEQ Рисунок \* ARABIC </w:instrText>
+      </w:r>
+      <w:r>
+        <w:fldChar w:fldCharType="separate"/>
+      </w:r>
+      <w:r>
+        <w:rPr>
+          <w:noProof/>
+        </w:rPr>
+        <w:t>34</w:t>
+      </w:r>
+      <w:r>
+        <w:fldChar w:fldCharType="end"/>
+      </w:r>
+      <w:r>
+        <w:t xml:space="preserve"> – Проверка данных после </w:t>
+      </w:r>
+      <w:r>
+        <w:rPr>
+          <w:lang w:val="en-US"/>
+        </w:rPr>
+        <w:t>ROLLBACK</w:t>
+      </w:r>
+      <w:r>
+        <w:t>, часть 2</w:t>
+      </w:r>
+    </w:p>
+    <w:p>
+      <w:pPr>
+        <w:pStyle w:val="3"/>
+        <w:rPr>
+          <w:bCs/>
+          <w:lang w:val="en-US"/>
+        </w:rPr>
+      </w:pPr>
+      <w:r>
+        <w:rPr>
+          <w:bCs/>
+        </w:rPr>
+        <w:lastRenderedPageBreak/>
+        <w:t>М</w:t>
+      </w:r>
+      <w:r>
+        <w:rPr>
+          <w:bCs/>
+        </w:rPr>
+        <w:t>оделирование аномалии «Неповторяемое чтение»</w:t>
+      </w:r>
+    </w:p>
+    <w:p>
+      <w:pPr>
+        <w:pStyle w:val="aa"/>
+        <w:keepNext/>
+      </w:pPr>
+      <w:r>
+        <w:rPr>
+          <w:lang w:val="en-US"/>
+        </w:rPr>
+        <w:drawing>
+          <wp:inline distT="0" distB="0" distL="0" distR="0" wp14:anchorId="6107BA5D" wp14:editId="5BC45E2F">
+            <wp:extent cx="5940425" cy="1478915"/>
+            <wp:effectExtent l="0" t="0" r="3175" b="6985"/>
+            <wp:docPr id="39" name="Рисунок 39"/>
+            <wp:cNvGraphicFramePr>
+              <a:graphicFrameLocks xmlns:a="http://schemas.openxmlformats.org/drawingml/2006/main" noChangeAspect="1"/>
+            </wp:cNvGraphicFramePr>
+            <a:graphic xmlns:a="http://schemas.openxmlformats.org/drawingml/2006/main">
+              <a:graphicData uri="http://schemas.openxmlformats.org/drawingml/2006/picture">
+                <pic:pic xmlns:pic="http://schemas.openxmlformats.org/drawingml/2006/picture">
+                  <pic:nvPicPr>
+                    <pic:cNvPr id="1" name=""/>
+                    <pic:cNvPicPr/>
+                  </pic:nvPicPr>
+                  <pic:blipFill>
+                    <a:blip r:embed="rId42"/>
+                    <a:stretch>
+                      <a:fillRect/>
+                    </a:stretch>
+                  </pic:blipFill>
+                  <pic:spPr>
+                    <a:xfrm>
+                      <a:off x="0" y="0"/>
+                      <a:ext cx="5940425" cy="1478915"/>
+                    </a:xfrm>
+                    <a:prstGeom prst="rect">
+                      <a:avLst/>
+                    </a:prstGeom>
+                  </pic:spPr>
+                </pic:pic>
+              </a:graphicData>
+            </a:graphic>
+          </wp:inline>
+        </w:drawing>
+      </w:r>
+    </w:p>
+    <w:p>
+      <w:pPr>
+        <w:pStyle w:val="ab"/>
+      </w:pPr>
+      <w:r>
+        <w:t xml:space="preserve">Рисунок </w:t>
+      </w:r>
+      <w:r>
+        <w:fldChar w:fldCharType="begin"/>
+      </w:r>
+      <w:r>
+        <w:instrText xml:space="preserve"> SEQ Рисунок \* ARABIC </w:instrText>
+      </w:r>
+      <w:r>
+        <w:fldChar w:fldCharType="separate"/>
+      </w:r>
+      <w:r>
+        <w:rPr>
+          <w:noProof/>
+        </w:rPr>
+        <w:t>35</w:t>
+      </w:r>
+      <w:r>
+        <w:fldChar w:fldCharType="end"/>
+      </w:r>
+      <w:r>
+        <w:rPr>
+          <w:lang w:val="en-US"/>
+        </w:rPr>
+        <w:t xml:space="preserve"> – </w:t>
+      </w:r>
+      <w:r>
+        <w:t>Сценарий долгой транзакции</w:t>
+      </w:r>
+    </w:p>
+    <w:p>
+      <w:pPr>
+        <w:pStyle w:val="aa"/>
+        <w:keepNext/>
+      </w:pPr>
+      <w:r>
+        <w:drawing>
+          <wp:inline distT="0" distB="0" distL="0" distR="0" wp14:anchorId="7EC9D97F" wp14:editId="0116E676">
+            <wp:extent cx="5940425" cy="284480"/>
+            <wp:effectExtent l="0" t="0" r="3175" b="1270"/>
+            <wp:docPr id="40" name="Рисунок 40"/>
+            <wp:cNvGraphicFramePr>
+              <a:graphicFrameLocks xmlns:a="http://schemas.openxmlformats.org/drawingml/2006/main" noChangeAspect="1"/>
+            </wp:cNvGraphicFramePr>
+            <a:graphic xmlns:a="http://schemas.openxmlformats.org/drawingml/2006/main">
+              <a:graphicData uri="http://schemas.openxmlformats.org/drawingml/2006/picture">
+                <pic:pic xmlns:pic="http://schemas.openxmlformats.org/drawingml/2006/picture">
+                  <pic:nvPicPr>
+                    <pic:cNvPr id="1" name=""/>
+                    <pic:cNvPicPr/>
+                  </pic:nvPicPr>
+                  <pic:blipFill>
+                    <a:blip r:embed="rId43"/>
+                    <a:stretch>
+                      <a:fillRect/>
+                    </a:stretch>
+                  </pic:blipFill>
+                  <pic:spPr>
+                    <a:xfrm>
+                      <a:off x="0" y="0"/>
+                      <a:ext cx="5940425" cy="284480"/>
+                    </a:xfrm>
+                    <a:prstGeom prst="rect">
+                      <a:avLst/>
+                    </a:prstGeom>
+                  </pic:spPr>
+                </pic:pic>
+              </a:graphicData>
+            </a:graphic>
+          </wp:inline>
+        </w:drawing>
+      </w:r>
+    </w:p>
+    <w:p>
+      <w:pPr>
+        <w:pStyle w:val="ab"/>
+      </w:pPr>
+      <w:r>
+        <w:t xml:space="preserve">Рисунок </w:t>
+      </w:r>
+      <w:r>
+        <w:fldChar w:fldCharType="begin"/>
+      </w:r>
+      <w:r>
+        <w:instrText xml:space="preserve"> SEQ Рисунок \* ARABIC </w:instrText>
+      </w:r>
+      <w:r>
+        <w:fldChar w:fldCharType="separate"/>
+      </w:r>
+      <w:r>
+        <w:rPr>
+          <w:noProof/>
+        </w:rPr>
+        <w:t>36</w:t>
+      </w:r>
+      <w:r>
+        <w:fldChar w:fldCharType="end"/>
+      </w:r>
+      <w:r>
+        <w:t xml:space="preserve"> – Запрос на изменение цены</w:t>
+      </w:r>
+    </w:p>
+    <w:p>
+      <w:pPr>
+        <w:pStyle w:val="aa"/>
+        <w:keepNext/>
+      </w:pPr>
+      <w:r>
+        <w:rPr>
+          <w:lang w:val="en-US"/>
+        </w:rPr>
+        <w:drawing>
+          <wp:inline distT="0" distB="0" distL="0" distR="0" wp14:anchorId="602392C8" wp14:editId="491C08A0">
+            <wp:extent cx="5940425" cy="1510665"/>
+            <wp:effectExtent l="0" t="0" r="3175" b="0"/>
+            <wp:docPr id="37" name="Рисунок 37"/>
+            <wp:cNvGraphicFramePr>
+              <a:graphicFrameLocks xmlns:a="http://schemas.openxmlformats.org/drawingml/2006/main" noChangeAspect="1"/>
+            </wp:cNvGraphicFramePr>
+            <a:graphic xmlns:a="http://schemas.openxmlformats.org/drawingml/2006/main">
+              <a:graphicData uri="http://schemas.openxmlformats.org/drawingml/2006/picture">
+                <pic:pic xmlns:pic="http://schemas.openxmlformats.org/drawingml/2006/picture">
+                  <pic:nvPicPr>
+                    <pic:cNvPr id="1" name=""/>
+                    <pic:cNvPicPr/>
+                  </pic:nvPicPr>
+                  <pic:blipFill>
+                    <a:blip r:embed="rId44"/>
+                    <a:stretch>
+                      <a:fillRect/>
+                    </a:stretch>
+                  </pic:blipFill>
+                  <pic:spPr>
+                    <a:xfrm>
+                      <a:off x="0" y="0"/>
+                      <a:ext cx="5940425" cy="1510665"/>
+                    </a:xfrm>
+                    <a:prstGeom prst="rect">
+                      <a:avLst/>
+                    </a:prstGeom>
+                  </pic:spPr>
+                </pic:pic>
+              </a:graphicData>
+            </a:graphic>
+          </wp:inline>
+        </w:drawing>
+      </w:r>
+    </w:p>
+    <w:p>
+      <w:pPr>
+        <w:pStyle w:val="ab"/>
+      </w:pPr>
+      <w:r>
+        <w:t xml:space="preserve">Рисунок </w:t>
+      </w:r>
+      <w:r>
+        <w:fldChar w:fldCharType="begin"/>
+      </w:r>
+      <w:r>
+        <w:instrText xml:space="preserve"> SEQ Рисунок \* ARABIC </w:instrText>
+      </w:r>
+      <w:r>
+        <w:fldChar w:fldCharType="separate"/>
+      </w:r>
+      <w:r>
+        <w:rPr>
+          <w:noProof/>
+        </w:rPr>
+        <w:t>37</w:t>
+      </w:r>
+      <w:r>
+        <w:fldChar w:fldCharType="end"/>
+      </w:r>
+      <w:r>
+        <w:t xml:space="preserve"> – Цена в начале запроса</w:t>
+      </w:r>
+    </w:p>
+    <w:p>
+      <w:pPr>
+        <w:pStyle w:val="aa"/>
+        <w:keepNext/>
+      </w:pPr>
+      <w:r>
+        <w:rPr>
+          <w:lang w:val="en-US"/>
+        </w:rPr>
+        <w:drawing>
+          <wp:inline distT="0" distB="0" distL="0" distR="0" wp14:anchorId="1FEB5EA4" wp14:editId="025DD910">
+            <wp:extent cx="5940425" cy="1534795"/>
+            <wp:effectExtent l="0" t="0" r="3175" b="8255"/>
+            <wp:docPr id="38" name="Рисунок 38"/>
+            <wp:cNvGraphicFramePr>
+              <a:graphicFrameLocks xmlns:a="http://schemas.openxmlformats.org/drawingml/2006/main" noChangeAspect="1"/>
+            </wp:cNvGraphicFramePr>
+            <a:graphic xmlns:a="http://schemas.openxmlformats.org/drawingml/2006/main">
+              <a:graphicData uri="http://schemas.openxmlformats.org/drawingml/2006/picture">
+                <pic:pic xmlns:pic="http://schemas.openxmlformats.org/drawingml/2006/picture">
+                  <pic:nvPicPr>
+                    <pic:cNvPr id="1" name=""/>
+                    <pic:cNvPicPr/>
+                  </pic:nvPicPr>
+                  <pic:blipFill>
+                    <a:blip r:embed="rId45"/>
+                    <a:stretch>
+                      <a:fillRect/>
+                    </a:stretch>
+                  </pic:blipFill>
+                  <pic:spPr>
+                    <a:xfrm>
+                      <a:off x="0" y="0"/>
+                      <a:ext cx="5940425" cy="1534795"/>
+                    </a:xfrm>
+                    <a:prstGeom prst="rect">
+                      <a:avLst/>
+                    </a:prstGeom>
+                  </pic:spPr>
+                </pic:pic>
+              </a:graphicData>
+            </a:graphic>
+          </wp:inline>
+        </w:drawing>
+      </w:r>
+    </w:p>
+    <w:p>
+      <w:pPr>
+        <w:pStyle w:val="ab"/>
+      </w:pPr>
+      <w:r>
+        <w:t xml:space="preserve">Рисунок </w:t>
+      </w:r>
+      <w:r>
+        <w:fldChar w:fldCharType="begin"/>
+      </w:r>
+      <w:r>
+        <w:instrText xml:space="preserve"> SEQ Рисунок \* ARABIC </w:instrText>
+      </w:r>
+      <w:r>
+        <w:fldChar w:fldCharType="separate"/>
+      </w:r>
+      <w:r>
+        <w:rPr>
+          <w:noProof/>
+        </w:rPr>
+        <w:t>38</w:t>
+      </w:r>
+      <w:r>
+        <w:fldChar w:fldCharType="end"/>
+      </w:r>
+      <w:r>
+        <w:t xml:space="preserve"> – Цена в конце запроса</w:t>
+      </w:r>
+    </w:p>
+    <w:p>
+      <w:pPr>
+        <w:pStyle w:val="3"/>
+        <w:rPr>
+          <w:bCs/>
+        </w:rPr>
+      </w:pPr>
+      <w:r>
+        <w:rPr>
+          <w:bCs/>
+        </w:rPr>
+        <w:t>У</w:t>
+      </w:r>
+      <w:r>
+        <w:rPr>
+          <w:bCs/>
+        </w:rPr>
+        <w:t>странение аномалии «Неповторяемое чтение»</w:t>
+      </w:r>
+    </w:p>
+    <w:p>
+      <w:pPr>
+        <w:pStyle w:val="aa"/>
+        <w:keepNext/>
+      </w:pPr>
+      <w:r>
+        <w:drawing>
+          <wp:inline distT="0" distB="0" distL="0" distR="0" wp14:anchorId="557B9746" wp14:editId="605C03E0">
+            <wp:extent cx="5394791" cy="1670050"/>
+            <wp:effectExtent l="0" t="0" r="0" b="6350"/>
+            <wp:docPr id="44" name="Рисунок 44"/>
+            <wp:cNvGraphicFramePr>
+              <a:graphicFrameLocks xmlns:a="http://schemas.openxmlformats.org/drawingml/2006/main" noChangeAspect="1"/>
+            </wp:cNvGraphicFramePr>
+            <a:graphic xmlns:a="http://schemas.openxmlformats.org/drawingml/2006/main">
+              <a:graphicData uri="http://schemas.openxmlformats.org/drawingml/2006/picture">
+                <pic:pic xmlns:pic="http://schemas.openxmlformats.org/drawingml/2006/picture">
+                  <pic:nvPicPr>
+                    <pic:cNvPr id="1" name=""/>
+                    <pic:cNvPicPr/>
+                  </pic:nvPicPr>
+                  <pic:blipFill>
+                    <a:blip r:embed="rId46"/>
+                    <a:stretch>
+                      <a:fillRect/>
+                    </a:stretch>
+                  </pic:blipFill>
+                  <pic:spPr>
+                    <a:xfrm>
+                      <a:off x="0" y="0"/>
+                      <a:ext cx="5405640" cy="1673408"/>
+                    </a:xfrm>
+                    <a:prstGeom prst="rect">
+                      <a:avLst/>
+                    </a:prstGeom>
+                  </pic:spPr>
+                </pic:pic>
+              </a:graphicData>
+            </a:graphic>
+          </wp:inline>
+        </w:drawing>
+      </w:r>
+    </w:p>
+    <w:p>
+      <w:pPr>
+        <w:pStyle w:val="ab"/>
+        <w:rPr>
+          <w:lang w:val="en-US"/>
+        </w:rPr>
+      </w:pPr>
+      <w:r>
+        <w:t xml:space="preserve">Рисунок </w:t>
+      </w:r>
+      <w:r>
+        <w:fldChar w:fldCharType="begin"/>
+      </w:r>
+      <w:r>
+        <w:instrText xml:space="preserve"> SEQ Рисунок \* ARABIC </w:instrText>
+      </w:r>
+      <w:r>
+        <w:fldChar w:fldCharType="separate"/>
+      </w:r>
+      <w:r>
+        <w:rPr>
+          <w:noProof/>
+        </w:rPr>
+        <w:t>39</w:t>
+      </w:r>
+      <w:r>
+        <w:fldChar w:fldCharType="end"/>
+      </w:r>
+      <w:r>
+        <w:t xml:space="preserve"> – Сценарий долгой транзакции с повторяемым чтением</w:t>
+      </w:r>
+    </w:p>
+    <w:p>
+      <w:pPr>
+        <w:pStyle w:val="aa"/>
+        <w:keepNext/>
+      </w:pPr>
+      <w:r>
+        <w:rPr>
+          <w:lang w:val="en-US"/>
+        </w:rPr>
+        <w:lastRenderedPageBreak/>
+        <w:drawing>
+          <wp:inline distT="0" distB="0" distL="0" distR="0" wp14:anchorId="6E9FD7F0" wp14:editId="052BF2C6">
+            <wp:extent cx="5940425" cy="1510665"/>
+            <wp:effectExtent l="0" t="0" r="3175" b="0"/>
+            <wp:docPr id="43" name="Рисунок 43"/>
+            <wp:cNvGraphicFramePr>
+              <a:graphicFrameLocks xmlns:a="http://schemas.openxmlformats.org/drawingml/2006/main" noChangeAspect="1"/>
+            </wp:cNvGraphicFramePr>
+            <a:graphic xmlns:a="http://schemas.openxmlformats.org/drawingml/2006/main">
+              <a:graphicData uri="http://schemas.openxmlformats.org/drawingml/2006/picture">
+                <pic:pic xmlns:pic="http://schemas.openxmlformats.org/drawingml/2006/picture">
+                  <pic:nvPicPr>
+                    <pic:cNvPr id="1" name=""/>
+                    <pic:cNvPicPr/>
+                  </pic:nvPicPr>
+                  <pic:blipFill>
+                    <a:blip r:embed="rId44"/>
+                    <a:stretch>
+                      <a:fillRect/>
+                    </a:stretch>
+                  </pic:blipFill>
+                  <pic:spPr>
+                    <a:xfrm>
+                      <a:off x="0" y="0"/>
+                      <a:ext cx="5940425" cy="1510665"/>
+                    </a:xfrm>
+                    <a:prstGeom prst="rect">
+                      <a:avLst/>
+                    </a:prstGeom>
+                  </pic:spPr>
+                </pic:pic>
+              </a:graphicData>
+            </a:graphic>
+          </wp:inline>
+        </w:drawing>
+      </w:r>
+    </w:p>
+    <w:p>
+      <w:pPr>
+        <w:pStyle w:val="ab"/>
+      </w:pPr>
+      <w:r>
+        <w:t xml:space="preserve">Рисунок </w:t>
+      </w:r>
+      <w:r>
+        <w:fldChar w:fldCharType="begin"/>
+      </w:r>
+      <w:r>
+        <w:instrText xml:space="preserve"> SEQ Рисунок \* ARABIC </w:instrText>
+      </w:r>
+      <w:r>
+        <w:fldChar w:fldCharType="separate"/>
+      </w:r>
+      <w:r>
+        <w:rPr>
+          <w:noProof/>
+        </w:rPr>
+        <w:t>40</w:t>
+      </w:r>
+      <w:r>
+        <w:fldChar w:fldCharType="end"/>
+      </w:r>
+      <w:r>
+        <w:t xml:space="preserve"> – Цена в начале запроса</w:t>
+      </w:r>
+    </w:p>
+    <w:p>
+      <w:pPr>
+        <w:pStyle w:val="aa"/>
+        <w:keepNext/>
+      </w:pPr>
+      <w:r>
+        <w:drawing>
+          <wp:inline distT="0" distB="0" distL="0" distR="0" wp14:anchorId="14416214" wp14:editId="138DA41B">
+            <wp:extent cx="5940425" cy="1582420"/>
+            <wp:effectExtent l="0" t="0" r="3175" b="0"/>
+            <wp:docPr id="41" name="Рисунок 41"/>
+            <wp:cNvGraphicFramePr>
+              <a:graphicFrameLocks xmlns:a="http://schemas.openxmlformats.org/drawingml/2006/main" noChangeAspect="1"/>
+            </wp:cNvGraphicFramePr>
+            <a:graphic xmlns:a="http://schemas.openxmlformats.org/drawingml/2006/main">
+              <a:graphicData uri="http://schemas.openxmlformats.org/drawingml/2006/picture">
+                <pic:pic xmlns:pic="http://schemas.openxmlformats.org/drawingml/2006/picture">
+                  <pic:nvPicPr>
+                    <pic:cNvPr id="1" name=""/>
+                    <pic:cNvPicPr/>
+                  </pic:nvPicPr>
+                  <pic:blipFill>
+                    <a:blip r:embed="rId47"/>
+                    <a:stretch>
+                      <a:fillRect/>
+                    </a:stretch>
+                  </pic:blipFill>
+                  <pic:spPr>
+                    <a:xfrm>
+                      <a:off x="0" y="0"/>
+                      <a:ext cx="5940425" cy="1582420"/>
+                    </a:xfrm>
+                    <a:prstGeom prst="rect">
+                      <a:avLst/>
+                    </a:prstGeom>
+                  </pic:spPr>
+                </pic:pic>
+              </a:graphicData>
+            </a:graphic>
+          </wp:inline>
+        </w:drawing>
+      </w:r>
+    </w:p>
+    <w:p>
+      <w:pPr>
+        <w:pStyle w:val="ab"/>
+      </w:pPr>
+      <w:r>
+        <w:t xml:space="preserve">Рисунок </w:t>
+      </w:r>
+      <w:r>
+        <w:fldChar w:fldCharType="begin"/>
+      </w:r>
+      <w:r>
+        <w:instrText xml:space="preserve"> SEQ Рисунок \* ARABIC </w:instrText>
+      </w:r>
+      <w:r>
+        <w:fldChar w:fldCharType="separate"/>
+      </w:r>
+      <w:r>
+        <w:rPr>
+          <w:noProof/>
+        </w:rPr>
+        <w:t>41</w:t>
+      </w:r>
+      <w:r>
+        <w:fldChar w:fldCharType="end"/>
+      </w:r>
+      <w:r>
+        <w:t xml:space="preserve"> – Цена в конце запроса</w:t>
+      </w:r>
     </w:p>
     <w:sectPr>
-      <w:footerReference w:type="first" r:id="rId24"/>
+      <w:footerReference w:type="first" r:id="rId48"/>
       <w:pgSz w:w="11906" w:h="16838"/>
       <w:pgMar w:top="1134" w:right="850" w:bottom="1134" w:left="1701" w:header="708" w:footer="708" w:gutter="0"/>
       <w:cols w:space="708"/>
@@ -5531,10 +9274,11 @@
     <w:basedOn w:val="a4"/>
     <w:next w:val="a4"/>
     <w:qFormat/>
-    <w:rsid w:val="006308D1"/>
+    <w:rsid w:val="00FE6DC3"/>
     <w:pPr>
+      <w:spacing w:line="240" w:lineRule="auto"/>
       <w:ind w:firstLine="0"/>
-      <w:jc w:val="center"/>
+      <w:jc w:val="left"/>
     </w:pPr>
     <w:rPr>
       <w:sz w:val="24"/>

</xml_diff>